<commit_message>
Avances: Minería de datos
Acabé la práctica 2
Inicié análisis del PIA
</commit_message>
<xml_diff>
--- a/Minería de datos/Practica 1/Práctica 1.docx
+++ b/Minería de datos/Practica 1/Práctica 1.docx
@@ -481,25 +481,7 @@
                                 <w:sz w:val="40"/>
                                 <w:szCs w:val="36"/>
                               </w:rPr>
-                              <w:t xml:space="preserve">Ranfery </w:t>
-                            </w:r>
-                            <w:proofErr w:type="spellStart"/>
-                            <w:r>
-                              <w:rPr>
-                                <w:rFonts w:ascii="Arial" w:hAnsi="Arial" w:cs="Arial"/>
-                                <w:sz w:val="40"/>
-                                <w:szCs w:val="36"/>
-                              </w:rPr>
-                              <w:t>Josua</w:t>
-                            </w:r>
-                            <w:proofErr w:type="spellEnd"/>
-                            <w:r>
-                              <w:rPr>
-                                <w:rFonts w:ascii="Arial" w:hAnsi="Arial" w:cs="Arial"/>
-                                <w:sz w:val="40"/>
-                                <w:szCs w:val="36"/>
-                              </w:rPr>
-                              <w:t xml:space="preserve"> Peregrina Morales</w:t>
+                              <w:t>Ranfery Josua Peregrina Morales</w:t>
                             </w:r>
                           </w:p>
                         </w:txbxContent>
@@ -575,118 +557,7 @@
         <mc:AlternateContent>
           <mc:Choice Requires="wps">
             <w:drawing>
-              <wp:anchor distT="45720" distB="45720" distL="114300" distR="114300" simplePos="0" relativeHeight="251670528" behindDoc="0" locked="0" layoutInCell="1" allowOverlap="1" wp14:anchorId="0E3E9F36" wp14:editId="136E8EEC">
-                <wp:simplePos x="0" y="0"/>
-                <wp:positionH relativeFrom="margin">
-                  <wp:posOffset>1956435</wp:posOffset>
-                </wp:positionH>
-                <wp:positionV relativeFrom="paragraph">
-                  <wp:posOffset>3911691</wp:posOffset>
-                </wp:positionV>
-                <wp:extent cx="3959860" cy="391795"/>
-                <wp:effectExtent l="0" t="0" r="0" b="0"/>
-                <wp:wrapSquare wrapText="bothSides"/>
-                <wp:docPr id="17" name="Cuadro de texto 2"/>
-                <wp:cNvGraphicFramePr>
-                  <a:graphicFrameLocks xmlns:a="http://schemas.openxmlformats.org/drawingml/2006/main"/>
-                </wp:cNvGraphicFramePr>
-                <a:graphic xmlns:a="http://schemas.openxmlformats.org/drawingml/2006/main">
-                  <a:graphicData uri="http://schemas.microsoft.com/office/word/2010/wordprocessingShape">
-                    <wps:wsp>
-                      <wps:cNvSpPr txBox="1">
-                        <a:spLocks noChangeArrowheads="1"/>
-                      </wps:cNvSpPr>
-                      <wps:spPr bwMode="auto">
-                        <a:xfrm>
-                          <a:off x="0" y="0"/>
-                          <a:ext cx="3959860" cy="391795"/>
-                        </a:xfrm>
-                        <a:prstGeom prst="rect">
-                          <a:avLst/>
-                        </a:prstGeom>
-                        <a:noFill/>
-                        <a:ln w="9525">
-                          <a:noFill/>
-                          <a:miter lim="800000"/>
-                          <a:headEnd/>
-                          <a:tailEnd/>
-                        </a:ln>
-                      </wps:spPr>
-                      <wps:txbx>
-                        <w:txbxContent>
-                          <w:p>
-                            <w:pPr>
-                              <w:rPr>
-                                <w:rFonts w:ascii="Arial" w:hAnsi="Arial" w:cs="Arial"/>
-                                <w:sz w:val="40"/>
-                                <w:szCs w:val="36"/>
-                              </w:rPr>
-                            </w:pPr>
-                            <w:r>
-                              <w:rPr>
-                                <w:rFonts w:ascii="Arial" w:hAnsi="Arial" w:cs="Arial"/>
-                                <w:sz w:val="40"/>
-                                <w:szCs w:val="36"/>
-                              </w:rPr>
-                              <w:t>1924910</w:t>
-                            </w:r>
-                          </w:p>
-                        </w:txbxContent>
-                      </wps:txbx>
-                      <wps:bodyPr rot="0" vert="horz" wrap="square" lIns="91440" tIns="45720" rIns="91440" bIns="45720" anchor="t" anchorCtr="0">
-                        <a:noAutofit/>
-                      </wps:bodyPr>
-                    </wps:wsp>
-                  </a:graphicData>
-                </a:graphic>
-                <wp14:sizeRelH relativeFrom="margin">
-                  <wp14:pctWidth>0</wp14:pctWidth>
-                </wp14:sizeRelH>
-                <wp14:sizeRelV relativeFrom="margin">
-                  <wp14:pctHeight>0</wp14:pctHeight>
-                </wp14:sizeRelV>
-              </wp:anchor>
-            </w:drawing>
-          </mc:Choice>
-          <mc:Fallback>
-            <w:pict>
-              <v:shape w14:anchorId="0E3E9F36" id="_x0000_s1030" type="#_x0000_t202" style="position:absolute;margin-left:154.05pt;margin-top:308pt;width:311.8pt;height:30.85pt;z-index:251670528;visibility:visible;mso-wrap-style:square;mso-width-percent:0;mso-height-percent:0;mso-wrap-distance-left:9pt;mso-wrap-distance-top:3.6pt;mso-wrap-distance-right:9pt;mso-wrap-distance-bottom:3.6pt;mso-position-horizontal:absolute;mso-position-horizontal-relative:margin;mso-position-vertical:absolute;mso-position-vertical-relative:text;mso-width-percent:0;mso-height-percent:0;mso-width-relative:margin;mso-height-relative:margin;v-text-anchor:top" o:gfxdata="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" filled="f" stroked="f">
-                <v:textbox>
-                  <w:txbxContent>
-                    <w:p>
-                      <w:pPr>
-                        <w:rPr>
-                          <w:rFonts w:ascii="Arial" w:hAnsi="Arial" w:cs="Arial"/>
-                          <w:sz w:val="40"/>
-                          <w:szCs w:val="36"/>
-                        </w:rPr>
-                      </w:pPr>
-                      <w:r>
-                        <w:rPr>
-                          <w:rFonts w:ascii="Arial" w:hAnsi="Arial" w:cs="Arial"/>
-                          <w:sz w:val="40"/>
-                          <w:szCs w:val="36"/>
-                        </w:rPr>
-                        <w:t>1924910</w:t>
-                      </w:r>
-                    </w:p>
-                  </w:txbxContent>
-                </v:textbox>
-                <w10:wrap type="square" anchorx="margin"/>
-              </v:shape>
-            </w:pict>
-          </mc:Fallback>
-        </mc:AlternateContent>
-      </w:r>
-      <w:r>
-        <w:rPr>
-          <w:noProof/>
-          <w:lang w:eastAsia="es-MX"/>
-        </w:rPr>
-        <mc:AlternateContent>
-          <mc:Choice Requires="wps">
-            <w:drawing>
-              <wp:anchor distT="45720" distB="45720" distL="114300" distR="114300" simplePos="0" relativeHeight="251665408" behindDoc="0" locked="0" layoutInCell="1" allowOverlap="1" wp14:anchorId="7868344C" wp14:editId="23B66128">
+              <wp:anchor distT="45720" distB="45720" distL="114300" distR="114300" simplePos="0" relativeHeight="251665408" behindDoc="0" locked="0" layoutInCell="1" allowOverlap="1" wp14:anchorId="7868344C" wp14:editId="15D076EC">
                 <wp:simplePos x="0" y="0"/>
                 <wp:positionH relativeFrom="margin">
                   <wp:align>left</wp:align>
@@ -763,7 +634,11 @@
           </mc:Choice>
           <mc:Fallback>
             <w:pict>
-              <v:shape w14:anchorId="7868344C" id="_x0000_s1031" type="#_x0000_t202" style="position:absolute;margin-left:0;margin-top:245.9pt;width:167.25pt;height:45.3pt;z-index:251665408;visibility:visible;mso-wrap-style:square;mso-width-percent:0;mso-height-percent:0;mso-wrap-distance-left:9pt;mso-wrap-distance-top:3.6pt;mso-wrap-distance-right:9pt;mso-wrap-distance-bottom:3.6pt;mso-position-horizontal:left;mso-position-horizontal-relative:margin;mso-position-vertical:absolute;mso-position-vertical-relative:text;mso-width-percent:0;mso-height-percent:0;mso-width-relative:margin;mso-height-relative:margin;v-text-anchor:top" o:gfxdata="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" filled="f" stroked="f">
+              <v:shapetype w14:anchorId="7868344C" id="_x0000_t202" coordsize="21600,21600" o:spt="202" path="m,l,21600r21600,l21600,xe">
+                <v:stroke joinstyle="miter"/>
+                <v:path gradientshapeok="t" o:connecttype="rect"/>
+              </v:shapetype>
+              <v:shape id="_x0000_s1030" type="#_x0000_t202" style="position:absolute;margin-left:0;margin-top:245.9pt;width:167.25pt;height:45.3pt;z-index:251665408;visibility:visible;mso-wrap-style:square;mso-width-percent:0;mso-height-percent:0;mso-wrap-distance-left:9pt;mso-wrap-distance-top:3.6pt;mso-wrap-distance-right:9pt;mso-wrap-distance-bottom:3.6pt;mso-position-horizontal:left;mso-position-horizontal-relative:margin;mso-position-vertical:absolute;mso-position-vertical-relative:text;mso-width-percent:0;mso-height-percent:0;mso-width-relative:margin;mso-height-relative:margin;v-text-anchor:top" o:gfxdata="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" filled="f" stroked="f">
                 <v:textbox>
                   <w:txbxContent>
                     <w:p>
@@ -2008,6 +1883,117 @@
         <mc:AlternateContent>
           <mc:Choice Requires="wps">
             <w:drawing>
+              <wp:anchor distT="45720" distB="45720" distL="114300" distR="114300" simplePos="0" relativeHeight="251670528" behindDoc="0" locked="0" layoutInCell="1" allowOverlap="1" wp14:anchorId="0E3E9F36" wp14:editId="5EDE5863">
+                <wp:simplePos x="0" y="0"/>
+                <wp:positionH relativeFrom="margin">
+                  <wp:posOffset>2146935</wp:posOffset>
+                </wp:positionH>
+                <wp:positionV relativeFrom="paragraph">
+                  <wp:posOffset>3520440</wp:posOffset>
+                </wp:positionV>
+                <wp:extent cx="3959860" cy="391795"/>
+                <wp:effectExtent l="0" t="0" r="0" b="0"/>
+                <wp:wrapSquare wrapText="bothSides"/>
+                <wp:docPr id="17" name="Cuadro de texto 2"/>
+                <wp:cNvGraphicFramePr>
+                  <a:graphicFrameLocks xmlns:a="http://schemas.openxmlformats.org/drawingml/2006/main"/>
+                </wp:cNvGraphicFramePr>
+                <a:graphic xmlns:a="http://schemas.openxmlformats.org/drawingml/2006/main">
+                  <a:graphicData uri="http://schemas.microsoft.com/office/word/2010/wordprocessingShape">
+                    <wps:wsp>
+                      <wps:cNvSpPr txBox="1">
+                        <a:spLocks noChangeArrowheads="1"/>
+                      </wps:cNvSpPr>
+                      <wps:spPr bwMode="auto">
+                        <a:xfrm>
+                          <a:off x="0" y="0"/>
+                          <a:ext cx="3959860" cy="391795"/>
+                        </a:xfrm>
+                        <a:prstGeom prst="rect">
+                          <a:avLst/>
+                        </a:prstGeom>
+                        <a:noFill/>
+                        <a:ln w="9525">
+                          <a:noFill/>
+                          <a:miter lim="800000"/>
+                          <a:headEnd/>
+                          <a:tailEnd/>
+                        </a:ln>
+                      </wps:spPr>
+                      <wps:txbx>
+                        <w:txbxContent>
+                          <w:p>
+                            <w:pPr>
+                              <w:rPr>
+                                <w:rFonts w:ascii="Arial" w:hAnsi="Arial" w:cs="Arial"/>
+                                <w:sz w:val="40"/>
+                                <w:szCs w:val="36"/>
+                              </w:rPr>
+                            </w:pPr>
+                            <w:r>
+                              <w:rPr>
+                                <w:rFonts w:ascii="Arial" w:hAnsi="Arial" w:cs="Arial"/>
+                                <w:sz w:val="40"/>
+                                <w:szCs w:val="36"/>
+                              </w:rPr>
+                              <w:t>1924910</w:t>
+                            </w:r>
+                          </w:p>
+                        </w:txbxContent>
+                      </wps:txbx>
+                      <wps:bodyPr rot="0" vert="horz" wrap="square" lIns="91440" tIns="45720" rIns="91440" bIns="45720" anchor="t" anchorCtr="0">
+                        <a:noAutofit/>
+                      </wps:bodyPr>
+                    </wps:wsp>
+                  </a:graphicData>
+                </a:graphic>
+                <wp14:sizeRelH relativeFrom="margin">
+                  <wp14:pctWidth>0</wp14:pctWidth>
+                </wp14:sizeRelH>
+                <wp14:sizeRelV relativeFrom="margin">
+                  <wp14:pctHeight>0</wp14:pctHeight>
+                </wp14:sizeRelV>
+              </wp:anchor>
+            </w:drawing>
+          </mc:Choice>
+          <mc:Fallback>
+            <w:pict>
+              <v:shape w14:anchorId="0E3E9F36" id="_x0000_s1041" type="#_x0000_t202" style="position:absolute;margin-left:169.05pt;margin-top:277.2pt;width:311.8pt;height:30.85pt;z-index:251670528;visibility:visible;mso-wrap-style:square;mso-width-percent:0;mso-height-percent:0;mso-wrap-distance-left:9pt;mso-wrap-distance-top:3.6pt;mso-wrap-distance-right:9pt;mso-wrap-distance-bottom:3.6pt;mso-position-horizontal:absolute;mso-position-horizontal-relative:margin;mso-position-vertical:absolute;mso-position-vertical-relative:text;mso-width-percent:0;mso-height-percent:0;mso-width-relative:margin;mso-height-relative:margin;v-text-anchor:top" o:gfxdata="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" filled="f" stroked="f">
+                <v:textbox>
+                  <w:txbxContent>
+                    <w:p>
+                      <w:pPr>
+                        <w:rPr>
+                          <w:rFonts w:ascii="Arial" w:hAnsi="Arial" w:cs="Arial"/>
+                          <w:sz w:val="40"/>
+                          <w:szCs w:val="36"/>
+                        </w:rPr>
+                      </w:pPr>
+                      <w:r>
+                        <w:rPr>
+                          <w:rFonts w:ascii="Arial" w:hAnsi="Arial" w:cs="Arial"/>
+                          <w:sz w:val="40"/>
+                          <w:szCs w:val="36"/>
+                        </w:rPr>
+                        <w:t>1924910</w:t>
+                      </w:r>
+                    </w:p>
+                  </w:txbxContent>
+                </v:textbox>
+                <w10:wrap type="square" anchorx="margin"/>
+              </v:shape>
+            </w:pict>
+          </mc:Fallback>
+        </mc:AlternateContent>
+      </w:r>
+      <w:r>
+        <w:rPr>
+          <w:noProof/>
+          <w:lang w:eastAsia="es-MX"/>
+        </w:rPr>
+        <mc:AlternateContent>
+          <mc:Choice Requires="wps">
+            <w:drawing>
               <wp:anchor distT="45720" distB="45720" distL="114300" distR="114300" simplePos="0" relativeHeight="251671552" behindDoc="0" locked="0" layoutInCell="1" allowOverlap="1" wp14:anchorId="136D9EF9" wp14:editId="491A55EB">
                 <wp:simplePos x="0" y="0"/>
                 <wp:positionH relativeFrom="margin">
@@ -2117,6 +2103,15 @@
     </w:p>
     <w:sdt>
       <w:sdtPr>
+        <w:rPr>
+          <w:rFonts w:asciiTheme="minorHAnsi" w:eastAsiaTheme="minorHAnsi" w:hAnsiTheme="minorHAnsi" w:cstheme="minorBidi"/>
+          <w:color w:val="auto"/>
+          <w:kern w:val="2"/>
+          <w:sz w:val="24"/>
+          <w:szCs w:val="24"/>
+          <w:lang w:eastAsia="en-US"/>
+          <w14:ligatures w14:val="standardContextual"/>
+        </w:rPr>
         <w:id w:val="1268964238"/>
         <w:docPartObj>
           <w:docPartGallery w:val="Table of Contents"/>
@@ -2125,15 +2120,8 @@
       </w:sdtPr>
       <w:sdtEndPr>
         <w:rPr>
-          <w:rFonts w:asciiTheme="minorHAnsi" w:eastAsiaTheme="minorHAnsi" w:hAnsiTheme="minorHAnsi" w:cstheme="minorBidi"/>
           <w:b/>
           <w:bCs/>
-          <w:color w:val="auto"/>
-          <w:kern w:val="2"/>
-          <w:sz w:val="24"/>
-          <w:szCs w:val="24"/>
-          <w:lang w:eastAsia="en-US"/>
-          <w14:ligatures w14:val="standardContextual"/>
         </w:rPr>
       </w:sdtEndPr>
       <w:sdtContent>
@@ -2306,21 +2294,7 @@
                 <w:rStyle w:val="Hipervnculo"/>
                 <w:noProof/>
               </w:rPr>
-              <w:t>Conclusiones y result</w:t>
-            </w:r>
-            <w:r>
-              <w:rPr>
-                <w:rStyle w:val="Hipervnculo"/>
-                <w:noProof/>
-              </w:rPr>
-              <w:t>a</w:t>
-            </w:r>
-            <w:r>
-              <w:rPr>
-                <w:rStyle w:val="Hipervnculo"/>
-                <w:noProof/>
-              </w:rPr>
-              <w:t>dos</w:t>
+              <w:t>Conclusiones y resultados</w:t>
             </w:r>
             <w:r>
               <w:rPr>
@@ -2593,21 +2567,7 @@
                 <w:rStyle w:val="Hipervnculo"/>
                 <w:noProof/>
               </w:rPr>
-              <w:t>3.1.1 - Objeti</w:t>
-            </w:r>
-            <w:r>
-              <w:rPr>
-                <w:rStyle w:val="Hipervnculo"/>
-                <w:noProof/>
-              </w:rPr>
-              <w:t>v</w:t>
-            </w:r>
-            <w:r>
-              <w:rPr>
-                <w:rStyle w:val="Hipervnculo"/>
-                <w:noProof/>
-              </w:rPr>
-              <w:t>o:</w:t>
+              <w:t>3.1.1 - Objetivo:</w:t>
             </w:r>
             <w:r>
               <w:rPr>
@@ -2962,7 +2922,137 @@
       <w:bookmarkStart w:id="0" w:name="_Toc223370974"/>
       <w:r>
         <w:lastRenderedPageBreak/>
-        <w:t>1.1 - 3 Indicadores del World Bank Open Data y su relación con el objetivo.</w:t>
+        <w:t>Objetivo</w:t>
+      </w:r>
+    </w:p>
+    <w:p>
+      <w:r>
+        <w:t>Analizar el tratamiento para un registro de datos correspondiente a un objetivo determinado de la minería</w:t>
+      </w:r>
+    </w:p>
+    <w:p>
+      <w:pPr>
+        <w:pStyle w:val="Ttulo1"/>
+      </w:pPr>
+      <w:r>
+        <w:t>Marco teórico</w:t>
+      </w:r>
+    </w:p>
+    <w:p>
+      <w:r>
+        <w:t>Aquí va información sobre:</w:t>
+      </w:r>
+    </w:p>
+    <w:p>
+      <w:pPr>
+        <w:pStyle w:val="Prrafodelista"/>
+        <w:numPr>
+          <w:ilvl w:val="0"/>
+          <w:numId w:val="14"/>
+        </w:numPr>
+      </w:pPr>
+      <w:r>
+        <w:t>Tratamiento de datos</w:t>
+      </w:r>
+    </w:p>
+    <w:p>
+      <w:pPr>
+        <w:pStyle w:val="Prrafodelista"/>
+        <w:numPr>
+          <w:ilvl w:val="0"/>
+          <w:numId w:val="14"/>
+        </w:numPr>
+      </w:pPr>
+      <w:r>
+        <w:t>Eliminación de instancias repetidas</w:t>
+      </w:r>
+    </w:p>
+    <w:p>
+      <w:pPr>
+        <w:pStyle w:val="Prrafodelista"/>
+        <w:numPr>
+          <w:ilvl w:val="0"/>
+          <w:numId w:val="14"/>
+        </w:numPr>
+      </w:pPr>
+      <w:r>
+        <w:t>Eliminar instancias incompletas</w:t>
+      </w:r>
+    </w:p>
+    <w:p>
+      <w:pPr>
+        <w:pStyle w:val="Prrafodelista"/>
+        <w:numPr>
+          <w:ilvl w:val="0"/>
+          <w:numId w:val="14"/>
+        </w:numPr>
+      </w:pPr>
+      <w:r>
+        <w:t>Eliminar datos correlacionados entre sí</w:t>
+      </w:r>
+    </w:p>
+    <w:p>
+      <w:pPr>
+        <w:pStyle w:val="Prrafodelista"/>
+        <w:numPr>
+          <w:ilvl w:val="0"/>
+          <w:numId w:val="14"/>
+        </w:numPr>
+      </w:pPr>
+      <w:r>
+        <w:t>Proyectar los datos incompletos</w:t>
+      </w:r>
+    </w:p>
+    <w:p>
+      <w:pPr>
+        <w:pStyle w:val="Prrafodelista"/>
+        <w:numPr>
+          <w:ilvl w:val="0"/>
+          <w:numId w:val="14"/>
+        </w:numPr>
+      </w:pPr>
+      <w:r>
+        <w:t>Escalar los datos, nada de juntar centímetros con kilómetros ni nada así.</w:t>
+      </w:r>
+    </w:p>
+    <w:p>
+      <w:pPr>
+        <w:pStyle w:val="Prrafodelista"/>
+        <w:numPr>
+          <w:ilvl w:val="1"/>
+          <w:numId w:val="14"/>
+        </w:numPr>
+      </w:pPr>
+      <w:r>
+        <w:t>Escalado con Estadístico Z</w:t>
+      </w:r>
+    </w:p>
+    <w:p>
+      <w:pPr>
+        <w:pStyle w:val="Prrafodelista"/>
+        <w:numPr>
+          <w:ilvl w:val="1"/>
+          <w:numId w:val="14"/>
+        </w:numPr>
+      </w:pPr>
+      <w:r>
+        <w:t>Escalado con Línea recta</w:t>
+      </w:r>
+    </w:p>
+    <w:p>
+      <w:pPr>
+        <w:pStyle w:val="Ttulo1"/>
+      </w:pPr>
+      <w:r>
+        <w:t xml:space="preserve">3 </w:t>
+      </w:r>
+      <w:proofErr w:type="gramStart"/>
+      <w:r>
+        <w:t>Indicadores</w:t>
+      </w:r>
+      <w:proofErr w:type="gramEnd"/>
+      <w:r>
+        <w:t xml:space="preserve"> del World Bank Open Data y su relación con el objetivo.</w:t>
       </w:r>
       <w:bookmarkEnd w:id="0"/>
     </w:p>
@@ -3120,6 +3210,7 @@
     </w:p>
     <w:p>
       <w:r>
+        <w:lastRenderedPageBreak/>
         <w:t xml:space="preserve">Inicio creando 3 </w:t>
       </w:r>
       <w:proofErr w:type="spellStart"/>
@@ -3309,7 +3400,6 @@
     </w:p>
     <w:p>
       <w:r>
-        <w:lastRenderedPageBreak/>
         <w:t xml:space="preserve">Para los dos </w:t>
       </w:r>
       <w:proofErr w:type="spellStart"/>
@@ -3523,6 +3613,7 @@
         <w:rPr>
           <w:noProof/>
         </w:rPr>
+        <w:lastRenderedPageBreak/>
         <w:drawing>
           <wp:inline distT="0" distB="0" distL="0" distR="0" wp14:anchorId="344008BB" wp14:editId="179BC8F9">
             <wp:extent cx="3848637" cy="219106"/>
@@ -8004,6 +8095,119 @@
     </w:lvl>
   </w:abstractNum>
   <w:abstractNum w:abstractNumId="7" w15:restartNumberingAfterBreak="0">
+    <w:nsid w:val="581C68C9"/>
+    <w:multiLevelType w:val="hybridMultilevel"/>
+    <w:tmpl w:val="59D0DB0A"/>
+    <w:lvl w:ilvl="0" w:tplc="080A0001">
+      <w:start w:val="1"/>
+      <w:numFmt w:val="bullet"/>
+      <w:lvlText w:val=""/>
+      <w:lvlJc w:val="left"/>
+      <w:pPr>
+        <w:ind w:left="720" w:hanging="360"/>
+      </w:pPr>
+      <w:rPr>
+        <w:rFonts w:ascii="Symbol" w:hAnsi="Symbol" w:hint="default"/>
+      </w:rPr>
+    </w:lvl>
+    <w:lvl w:ilvl="1" w:tplc="080A0003">
+      <w:start w:val="1"/>
+      <w:numFmt w:val="bullet"/>
+      <w:lvlText w:val="o"/>
+      <w:lvlJc w:val="left"/>
+      <w:pPr>
+        <w:ind w:left="1440" w:hanging="360"/>
+      </w:pPr>
+      <w:rPr>
+        <w:rFonts w:ascii="Courier New" w:hAnsi="Courier New" w:cs="Courier New" w:hint="default"/>
+      </w:rPr>
+    </w:lvl>
+    <w:lvl w:ilvl="2" w:tplc="080A0005" w:tentative="1">
+      <w:start w:val="1"/>
+      <w:numFmt w:val="bullet"/>
+      <w:lvlText w:val=""/>
+      <w:lvlJc w:val="left"/>
+      <w:pPr>
+        <w:ind w:left="2160" w:hanging="360"/>
+      </w:pPr>
+      <w:rPr>
+        <w:rFonts w:ascii="Wingdings" w:hAnsi="Wingdings" w:hint="default"/>
+      </w:rPr>
+    </w:lvl>
+    <w:lvl w:ilvl="3" w:tplc="080A0001" w:tentative="1">
+      <w:start w:val="1"/>
+      <w:numFmt w:val="bullet"/>
+      <w:lvlText w:val=""/>
+      <w:lvlJc w:val="left"/>
+      <w:pPr>
+        <w:ind w:left="2880" w:hanging="360"/>
+      </w:pPr>
+      <w:rPr>
+        <w:rFonts w:ascii="Symbol" w:hAnsi="Symbol" w:hint="default"/>
+      </w:rPr>
+    </w:lvl>
+    <w:lvl w:ilvl="4" w:tplc="080A0003" w:tentative="1">
+      <w:start w:val="1"/>
+      <w:numFmt w:val="bullet"/>
+      <w:lvlText w:val="o"/>
+      <w:lvlJc w:val="left"/>
+      <w:pPr>
+        <w:ind w:left="3600" w:hanging="360"/>
+      </w:pPr>
+      <w:rPr>
+        <w:rFonts w:ascii="Courier New" w:hAnsi="Courier New" w:cs="Courier New" w:hint="default"/>
+      </w:rPr>
+    </w:lvl>
+    <w:lvl w:ilvl="5" w:tplc="080A0005" w:tentative="1">
+      <w:start w:val="1"/>
+      <w:numFmt w:val="bullet"/>
+      <w:lvlText w:val=""/>
+      <w:lvlJc w:val="left"/>
+      <w:pPr>
+        <w:ind w:left="4320" w:hanging="360"/>
+      </w:pPr>
+      <w:rPr>
+        <w:rFonts w:ascii="Wingdings" w:hAnsi="Wingdings" w:hint="default"/>
+      </w:rPr>
+    </w:lvl>
+    <w:lvl w:ilvl="6" w:tplc="080A0001" w:tentative="1">
+      <w:start w:val="1"/>
+      <w:numFmt w:val="bullet"/>
+      <w:lvlText w:val=""/>
+      <w:lvlJc w:val="left"/>
+      <w:pPr>
+        <w:ind w:left="5040" w:hanging="360"/>
+      </w:pPr>
+      <w:rPr>
+        <w:rFonts w:ascii="Symbol" w:hAnsi="Symbol" w:hint="default"/>
+      </w:rPr>
+    </w:lvl>
+    <w:lvl w:ilvl="7" w:tplc="080A0003" w:tentative="1">
+      <w:start w:val="1"/>
+      <w:numFmt w:val="bullet"/>
+      <w:lvlText w:val="o"/>
+      <w:lvlJc w:val="left"/>
+      <w:pPr>
+        <w:ind w:left="5760" w:hanging="360"/>
+      </w:pPr>
+      <w:rPr>
+        <w:rFonts w:ascii="Courier New" w:hAnsi="Courier New" w:cs="Courier New" w:hint="default"/>
+      </w:rPr>
+    </w:lvl>
+    <w:lvl w:ilvl="8" w:tplc="080A0005" w:tentative="1">
+      <w:start w:val="1"/>
+      <w:numFmt w:val="bullet"/>
+      <w:lvlText w:val=""/>
+      <w:lvlJc w:val="left"/>
+      <w:pPr>
+        <w:ind w:left="6480" w:hanging="360"/>
+      </w:pPr>
+      <w:rPr>
+        <w:rFonts w:ascii="Wingdings" w:hAnsi="Wingdings" w:hint="default"/>
+      </w:rPr>
+    </w:lvl>
+  </w:abstractNum>
+  <w:abstractNum w:abstractNumId="8" w15:restartNumberingAfterBreak="0">
     <w:nsid w:val="62657DE2"/>
     <w:multiLevelType w:val="hybridMultilevel"/>
     <w:tmpl w:val="49828C7C"/>
@@ -8116,7 +8320,7 @@
       </w:rPr>
     </w:lvl>
   </w:abstractNum>
-  <w:abstractNum w:abstractNumId="8" w15:restartNumberingAfterBreak="0">
+  <w:abstractNum w:abstractNumId="9" w15:restartNumberingAfterBreak="0">
     <w:nsid w:val="659E1CC5"/>
     <w:multiLevelType w:val="hybridMultilevel"/>
     <w:tmpl w:val="B02E8928"/>
@@ -8229,7 +8433,7 @@
       </w:rPr>
     </w:lvl>
   </w:abstractNum>
-  <w:abstractNum w:abstractNumId="9" w15:restartNumberingAfterBreak="0">
+  <w:abstractNum w:abstractNumId="10" w15:restartNumberingAfterBreak="0">
     <w:nsid w:val="6AA17384"/>
     <w:multiLevelType w:val="multilevel"/>
     <w:tmpl w:val="B9CC5E9E"/>
@@ -8378,7 +8582,7 @@
       </w:rPr>
     </w:lvl>
   </w:abstractNum>
-  <w:abstractNum w:abstractNumId="10" w15:restartNumberingAfterBreak="0">
+  <w:abstractNum w:abstractNumId="11" w15:restartNumberingAfterBreak="0">
     <w:nsid w:val="70F23B25"/>
     <w:multiLevelType w:val="hybridMultilevel"/>
     <w:tmpl w:val="7E00329E"/>
@@ -8491,7 +8695,95 @@
       </w:rPr>
     </w:lvl>
   </w:abstractNum>
-  <w:abstractNum w:abstractNumId="11" w15:restartNumberingAfterBreak="0">
+  <w:abstractNum w:abstractNumId="12" w15:restartNumberingAfterBreak="0">
+    <w:nsid w:val="71005E1F"/>
+    <w:multiLevelType w:val="hybridMultilevel"/>
+    <w:tmpl w:val="2A80F456"/>
+    <w:lvl w:ilvl="0" w:tplc="080A000F">
+      <w:start w:val="1"/>
+      <w:numFmt w:val="decimal"/>
+      <w:lvlText w:val="%1."/>
+      <w:lvlJc w:val="left"/>
+      <w:pPr>
+        <w:ind w:left="720" w:hanging="360"/>
+      </w:pPr>
+    </w:lvl>
+    <w:lvl w:ilvl="1" w:tplc="531CBC90">
+      <w:numFmt w:val="bullet"/>
+      <w:lvlText w:val="-"/>
+      <w:lvlJc w:val="left"/>
+      <w:pPr>
+        <w:ind w:left="1440" w:hanging="360"/>
+      </w:pPr>
+      <w:rPr>
+        <w:rFonts w:ascii="Aptos" w:eastAsiaTheme="minorHAnsi" w:hAnsi="Aptos" w:cstheme="minorBidi" w:hint="default"/>
+      </w:rPr>
+    </w:lvl>
+    <w:lvl w:ilvl="2" w:tplc="080A001B" w:tentative="1">
+      <w:start w:val="1"/>
+      <w:numFmt w:val="lowerRoman"/>
+      <w:lvlText w:val="%3."/>
+      <w:lvlJc w:val="right"/>
+      <w:pPr>
+        <w:ind w:left="2160" w:hanging="180"/>
+      </w:pPr>
+    </w:lvl>
+    <w:lvl w:ilvl="3" w:tplc="080A000F" w:tentative="1">
+      <w:start w:val="1"/>
+      <w:numFmt w:val="decimal"/>
+      <w:lvlText w:val="%4."/>
+      <w:lvlJc w:val="left"/>
+      <w:pPr>
+        <w:ind w:left="2880" w:hanging="360"/>
+      </w:pPr>
+    </w:lvl>
+    <w:lvl w:ilvl="4" w:tplc="080A0019" w:tentative="1">
+      <w:start w:val="1"/>
+      <w:numFmt w:val="lowerLetter"/>
+      <w:lvlText w:val="%5."/>
+      <w:lvlJc w:val="left"/>
+      <w:pPr>
+        <w:ind w:left="3600" w:hanging="360"/>
+      </w:pPr>
+    </w:lvl>
+    <w:lvl w:ilvl="5" w:tplc="080A001B" w:tentative="1">
+      <w:start w:val="1"/>
+      <w:numFmt w:val="lowerRoman"/>
+      <w:lvlText w:val="%6."/>
+      <w:lvlJc w:val="right"/>
+      <w:pPr>
+        <w:ind w:left="4320" w:hanging="180"/>
+      </w:pPr>
+    </w:lvl>
+    <w:lvl w:ilvl="6" w:tplc="080A000F" w:tentative="1">
+      <w:start w:val="1"/>
+      <w:numFmt w:val="decimal"/>
+      <w:lvlText w:val="%7."/>
+      <w:lvlJc w:val="left"/>
+      <w:pPr>
+        <w:ind w:left="5040" w:hanging="360"/>
+      </w:pPr>
+    </w:lvl>
+    <w:lvl w:ilvl="7" w:tplc="080A0019" w:tentative="1">
+      <w:start w:val="1"/>
+      <w:numFmt w:val="lowerLetter"/>
+      <w:lvlText w:val="%8."/>
+      <w:lvlJc w:val="left"/>
+      <w:pPr>
+        <w:ind w:left="5760" w:hanging="360"/>
+      </w:pPr>
+    </w:lvl>
+    <w:lvl w:ilvl="8" w:tplc="080A001B" w:tentative="1">
+      <w:start w:val="1"/>
+      <w:numFmt w:val="lowerRoman"/>
+      <w:lvlText w:val="%9."/>
+      <w:lvlJc w:val="right"/>
+      <w:pPr>
+        <w:ind w:left="6480" w:hanging="180"/>
+      </w:pPr>
+    </w:lvl>
+  </w:abstractNum>
+  <w:abstractNum w:abstractNumId="13" w15:restartNumberingAfterBreak="0">
     <w:nsid w:val="73CF2156"/>
     <w:multiLevelType w:val="hybridMultilevel"/>
     <w:tmpl w:val="55E6CB84"/>
@@ -8614,7 +8906,7 @@
     <w:abstractNumId w:val="3"/>
   </w:num>
   <w:num w:numId="4" w16cid:durableId="1724787420">
-    <w:abstractNumId w:val="11"/>
+    <w:abstractNumId w:val="13"/>
   </w:num>
   <w:num w:numId="5" w16cid:durableId="961040457">
     <w:abstractNumId w:val="5"/>
@@ -8623,13 +8915,13 @@
     <w:abstractNumId w:val="6"/>
   </w:num>
   <w:num w:numId="7" w16cid:durableId="954021543">
-    <w:abstractNumId w:val="7"/>
+    <w:abstractNumId w:val="8"/>
   </w:num>
   <w:num w:numId="8" w16cid:durableId="1162044590">
-    <w:abstractNumId w:val="10"/>
+    <w:abstractNumId w:val="11"/>
   </w:num>
   <w:num w:numId="9" w16cid:durableId="596836465">
-    <w:abstractNumId w:val="9"/>
+    <w:abstractNumId w:val="10"/>
   </w:num>
   <w:num w:numId="10" w16cid:durableId="1619751705">
     <w:abstractNumId w:val="4"/>
@@ -8638,7 +8930,13 @@
     <w:abstractNumId w:val="2"/>
   </w:num>
   <w:num w:numId="12" w16cid:durableId="1086465018">
-    <w:abstractNumId w:val="8"/>
+    <w:abstractNumId w:val="9"/>
+  </w:num>
+  <w:num w:numId="13" w16cid:durableId="890774993">
+    <w:abstractNumId w:val="12"/>
+  </w:num>
+  <w:num w:numId="14" w16cid:durableId="1542402213">
+    <w:abstractNumId w:val="7"/>
   </w:num>
 </w:numbering>
 </file>

</xml_diff>

<commit_message>
Avance: Minería de datos
Práctica 4, la primer parte con un script de Python, la segunda con R pero no quedó.
</commit_message>
<xml_diff>
--- a/Minería de datos/Practica 1/Práctica 1.docx
+++ b/Minería de datos/Practica 1/Práctica 1.docx
@@ -1,6 +1,6 @@
 
 <file path=word/document.xml><?xml version="1.0" encoding="utf-8"?>
-<w:document xmlns:wpc="http://schemas.microsoft.com/office/word/2010/wordprocessingCanvas" xmlns:cx="http://schemas.microsoft.com/office/drawing/2014/chartex" xmlns:cx1="http://schemas.microsoft.com/office/drawing/2015/9/8/chartex" xmlns:cx2="http://schemas.microsoft.com/office/drawing/2015/10/21/chartex" xmlns:cx3="http://schemas.microsoft.com/office/drawing/2016/5/9/chartex" xmlns:cx4="http://schemas.microsoft.com/office/drawing/2016/5/10/chartex" xmlns:cx5="http://schemas.microsoft.com/office/drawing/2016/5/11/chartex" xmlns:cx6="http://schemas.microsoft.com/office/drawing/2016/5/12/chartex" xmlns:cx7="http://schemas.microsoft.com/office/drawing/2016/5/13/chartex" xmlns:cx8="http://schemas.microsoft.com/office/drawing/2016/5/14/chartex" xmlns:mc="http://schemas.openxmlformats.org/markup-compatibility/2006" xmlns:aink="http://schemas.microsoft.com/office/drawing/2016/ink" xmlns:am3d="http://schemas.microsoft.com/office/drawing/2017/model3d" xmlns:o="urn:schemas-microsoft-com:office:office" xmlns:oel="http://schemas.microsoft.com/office/2019/extlst" xmlns:r="http://schemas.openxmlformats.org/officeDocument/2006/relationships" xmlns:m="http://schemas.openxmlformats.org/officeDocument/2006/math" xmlns:v="urn:schemas-microsoft-com:vml" xmlns:wp14="http://schemas.microsoft.com/office/word/2010/wordprocessingDrawing" xmlns:wp="http://schemas.openxmlformats.org/drawingml/2006/wordprocessingDrawing" xmlns:w10="urn:schemas-microsoft-com:office:word" xmlns:w="http://schemas.openxmlformats.org/wordprocessingml/2006/main" xmlns:w14="http://schemas.microsoft.com/office/word/2010/wordml" xmlns:w15="http://schemas.microsoft.com/office/word/2012/wordml" xmlns:w16cex="http://schemas.microsoft.com/office/word/2018/wordml/cex" xmlns:w16cid="http://schemas.microsoft.com/office/word/2016/wordml/cid" xmlns:w16="http://schemas.microsoft.com/office/word/2018/wordml" xmlns:w16du="http://schemas.microsoft.com/office/word/2023/wordml/word16du" xmlns:w16sdtdh="http://schemas.microsoft.com/office/word/2020/wordml/sdtdatahash" xmlns:w16sdtfl="http://schemas.microsoft.com/office/word/2024/wordml/sdtformatlock" xmlns:w16se="http://schemas.microsoft.com/office/word/2015/wordml/symex" xmlns:wpg="http://schemas.microsoft.com/office/word/2010/wordprocessingGroup" xmlns:wpi="http://schemas.microsoft.com/office/word/2010/wordprocessingInk" xmlns:wne="http://schemas.microsoft.com/office/word/2006/wordml" xmlns:wps="http://schemas.microsoft.com/office/word/2010/wordprocessingShape" mc:Ignorable="w14 w15 w16se w16cid w16 w16cex w16sdtdh w16sdtfl w16du wp14">
+<w:document xmlns:wpc="http://schemas.microsoft.com/office/word/2010/wordprocessingCanvas" xmlns:mc="http://schemas.openxmlformats.org/markup-compatibility/2006" xmlns:o="urn:schemas-microsoft-com:office:office" xmlns:r="http://schemas.openxmlformats.org/officeDocument/2006/relationships" xmlns:m="http://schemas.openxmlformats.org/officeDocument/2006/math" xmlns:v="urn:schemas-microsoft-com:vml" xmlns:wp14="http://schemas.microsoft.com/office/word/2010/wordprocessingDrawing" xmlns:wp="http://schemas.openxmlformats.org/drawingml/2006/wordprocessingDrawing" xmlns:w10="urn:schemas-microsoft-com:office:word" xmlns:w="http://schemas.openxmlformats.org/wordprocessingml/2006/main" xmlns:w14="http://schemas.microsoft.com/office/word/2010/wordml" xmlns:w15="http://schemas.microsoft.com/office/word/2012/wordml" xmlns:wpg="http://schemas.microsoft.com/office/word/2010/wordprocessingGroup" xmlns:wpi="http://schemas.microsoft.com/office/word/2010/wordprocessingInk" xmlns:wne="http://schemas.microsoft.com/office/word/2006/wordml" xmlns:wps="http://schemas.microsoft.com/office/word/2010/wordprocessingShape" mc:Ignorable="w14 w15 wp14">
   <w:body>
     <w:p>
       <w:pPr>
@@ -82,25 +82,7 @@
                                 <w:sz w:val="36"/>
                                 <w:szCs w:val="28"/>
                               </w:rPr>
-                              <w:t xml:space="preserve"> Enero – </w:t>
-                            </w:r>
-                            <w:proofErr w:type="gramStart"/>
-                            <w:r>
-                              <w:rPr>
-                                <w:rFonts w:ascii="Bahnschrift Light" w:hAnsi="Bahnschrift Light" w:cs="Arial"/>
-                                <w:sz w:val="36"/>
-                                <w:szCs w:val="28"/>
-                              </w:rPr>
-                              <w:t>Junio</w:t>
-                            </w:r>
-                            <w:proofErr w:type="gramEnd"/>
-                            <w:r>
-                              <w:rPr>
-                                <w:rFonts w:ascii="Bahnschrift Light" w:hAnsi="Bahnschrift Light" w:cs="Arial"/>
-                                <w:sz w:val="36"/>
-                                <w:szCs w:val="28"/>
-                              </w:rPr>
-                              <w:t xml:space="preserve"> 2026</w:t>
+                              <w:t xml:space="preserve"> Enero – Junio 2026</w:t>
                             </w:r>
                           </w:p>
                         </w:txbxContent>
@@ -120,7 +102,7 @@
               </wp:anchor>
             </w:drawing>
           </mc:Choice>
-          <mc:Fallback>
+          <mc:Fallback xmlns:w16se="http://schemas.microsoft.com/office/word/2015/wordml/symex" xmlns:w16sdtfl="http://schemas.microsoft.com/office/word/2024/wordml/sdtformatlock" xmlns:w16sdtdh="http://schemas.microsoft.com/office/word/2020/wordml/sdtdatahash" xmlns:w16du="http://schemas.microsoft.com/office/word/2023/wordml/word16du" xmlns:w16="http://schemas.microsoft.com/office/word/2018/wordml" xmlns:w16cid="http://schemas.microsoft.com/office/word/2016/wordml/cid" xmlns:w16cex="http://schemas.microsoft.com/office/word/2018/wordml/cex" xmlns:oel="http://schemas.microsoft.com/office/2019/extlst" xmlns:am3d="http://schemas.microsoft.com/office/drawing/2017/model3d" xmlns:aink="http://schemas.microsoft.com/office/drawing/2016/ink" xmlns:cx8="http://schemas.microsoft.com/office/drawing/2016/5/14/chartex" xmlns:cx7="http://schemas.microsoft.com/office/drawing/2016/5/13/chartex" xmlns:cx6="http://schemas.microsoft.com/office/drawing/2016/5/12/chartex" xmlns:cx5="http://schemas.microsoft.com/office/drawing/2016/5/11/chartex" xmlns:cx4="http://schemas.microsoft.com/office/drawing/2016/5/10/chartex" xmlns:cx3="http://schemas.microsoft.com/office/drawing/2016/5/9/chartex" xmlns:cx2="http://schemas.microsoft.com/office/drawing/2015/10/21/chartex" xmlns:cx1="http://schemas.microsoft.com/office/drawing/2015/9/8/chartex" xmlns:cx="http://schemas.microsoft.com/office/drawing/2014/chartex">
             <w:pict>
               <v:shapetype w14:anchorId="4DE9F267" id="_x0000_t202" coordsize="21600,21600" o:spt="202" path="m,l,21600r21600,l21600,xe">
                 <v:stroke joinstyle="miter"/>
@@ -248,7 +230,7 @@
                                 <w:sz w:val="40"/>
                                 <w:szCs w:val="36"/>
                               </w:rPr>
-                              <w:t>Nombre Actividad</w:t>
+                              <w:t>Práctica 1</w:t>
                             </w:r>
                           </w:p>
                         </w:txbxContent>
@@ -270,7 +252,11 @@
           </mc:Choice>
           <mc:Fallback>
             <w:pict>
-              <v:shape w14:anchorId="1AA8CFD9" id="_x0000_s1027" type="#_x0000_t202" style="position:absolute;margin-left:71.9pt;margin-top:176.2pt;width:345.3pt;height:45.3pt;z-index:251673600;visibility:visible;mso-wrap-style:square;mso-width-percent:0;mso-height-percent:0;mso-wrap-distance-left:9pt;mso-wrap-distance-top:3.6pt;mso-wrap-distance-right:9pt;mso-wrap-distance-bottom:3.6pt;mso-position-horizontal:absolute;mso-position-horizontal-relative:margin;mso-position-vertical:absolute;mso-position-vertical-relative:text;mso-width-percent:0;mso-height-percent:0;mso-width-relative:margin;mso-height-relative:margin;v-text-anchor:top" o:gfxdata="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" filled="f" stroked="f">
+              <v:shapetype w14:anchorId="1AA8CFD9" id="_x0000_t202" coordsize="21600,21600" o:spt="202" path="m,l,21600r21600,l21600,xe">
+                <v:stroke joinstyle="miter"/>
+                <v:path gradientshapeok="t" o:connecttype="rect"/>
+              </v:shapetype>
+              <v:shape id="_x0000_s1027" type="#_x0000_t202" style="position:absolute;margin-left:71.9pt;margin-top:176.2pt;width:345.3pt;height:45.3pt;z-index:251673600;visibility:visible;mso-wrap-style:square;mso-width-percent:0;mso-height-percent:0;mso-wrap-distance-left:9pt;mso-wrap-distance-top:3.6pt;mso-wrap-distance-right:9pt;mso-wrap-distance-bottom:3.6pt;mso-position-horizontal:absolute;mso-position-horizontal-relative:margin;mso-position-vertical:absolute;mso-position-vertical-relative:text;mso-width-percent:0;mso-height-percent:0;mso-width-relative:margin;mso-height-relative:margin;v-text-anchor:top" o:gfxdata="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" filled="f" stroked="f">
                 <v:textbox>
                   <w:txbxContent>
                     <w:p>
@@ -292,7 +278,7 @@
                           <w:sz w:val="40"/>
                           <w:szCs w:val="36"/>
                         </w:rPr>
-                        <w:t>Nombre Actividad</w:t>
+                        <w:t>Práctica 1</w:t>
                       </w:r>
                     </w:p>
                   </w:txbxContent>
@@ -367,7 +353,7 @@
                                 <w:sz w:val="36"/>
                                 <w:szCs w:val="32"/>
                               </w:rPr>
-                              <w:t>Subtítulo o instrucciones de la actividad</w:t>
+                              <w:t>Tratamiento de datos</w:t>
                             </w:r>
                           </w:p>
                         </w:txbxContent>
@@ -389,7 +375,7 @@
           </mc:Choice>
           <mc:Fallback>
             <w:pict>
-              <v:shape w14:anchorId="333BCFF7" id="_x0000_s1028" type="#_x0000_t202" style="position:absolute;margin-left:67.55pt;margin-top:206.65pt;width:345.3pt;height:45.3pt;z-index:251674624;visibility:visible;mso-wrap-style:square;mso-width-percent:0;mso-height-percent:0;mso-wrap-distance-left:9pt;mso-wrap-distance-top:3.6pt;mso-wrap-distance-right:9pt;mso-wrap-distance-bottom:3.6pt;mso-position-horizontal:absolute;mso-position-horizontal-relative:margin;mso-position-vertical:absolute;mso-position-vertical-relative:text;mso-width-percent:0;mso-height-percent:0;mso-width-relative:margin;mso-height-relative:margin;v-text-anchor:top" o:gfxdata="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" filled="f" stroked="f">
+              <v:shape w14:anchorId="333BCFF7" id="_x0000_s1028" type="#_x0000_t202" style="position:absolute;margin-left:67.55pt;margin-top:206.65pt;width:345.3pt;height:45.3pt;z-index:251674624;visibility:visible;mso-wrap-style:square;mso-width-percent:0;mso-height-percent:0;mso-wrap-distance-left:9pt;mso-wrap-distance-top:3.6pt;mso-wrap-distance-right:9pt;mso-wrap-distance-bottom:3.6pt;mso-position-horizontal:absolute;mso-position-horizontal-relative:margin;mso-position-vertical:absolute;mso-position-vertical-relative:text;mso-width-percent:0;mso-height-percent:0;mso-width-relative:margin;mso-height-relative:margin;v-text-anchor:top" o:gfxdata="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" filled="f" stroked="f">
                 <v:textbox>
                   <w:txbxContent>
                     <w:p>
@@ -409,7 +395,7 @@
                           <w:sz w:val="36"/>
                           <w:szCs w:val="32"/>
                         </w:rPr>
-                        <w:t>Subtítulo o instrucciones de la actividad</w:t>
+                        <w:t>Tratamiento de datos</w:t>
                       </w:r>
                     </w:p>
                   </w:txbxContent>
@@ -501,7 +487,7 @@
               </wp:anchor>
             </w:drawing>
           </mc:Choice>
-          <mc:Fallback>
+          <mc:Fallback xmlns:w16se="http://schemas.microsoft.com/office/word/2015/wordml/symex" xmlns:w16sdtfl="http://schemas.microsoft.com/office/word/2024/wordml/sdtformatlock" xmlns:w16sdtdh="http://schemas.microsoft.com/office/word/2020/wordml/sdtdatahash" xmlns:w16du="http://schemas.microsoft.com/office/word/2023/wordml/word16du" xmlns:w16="http://schemas.microsoft.com/office/word/2018/wordml" xmlns:w16cid="http://schemas.microsoft.com/office/word/2016/wordml/cid" xmlns:w16cex="http://schemas.microsoft.com/office/word/2018/wordml/cex" xmlns:oel="http://schemas.microsoft.com/office/2019/extlst" xmlns:am3d="http://schemas.microsoft.com/office/drawing/2017/model3d" xmlns:aink="http://schemas.microsoft.com/office/drawing/2016/ink" xmlns:cx8="http://schemas.microsoft.com/office/drawing/2016/5/14/chartex" xmlns:cx7="http://schemas.microsoft.com/office/drawing/2016/5/13/chartex" xmlns:cx6="http://schemas.microsoft.com/office/drawing/2016/5/12/chartex" xmlns:cx5="http://schemas.microsoft.com/office/drawing/2016/5/11/chartex" xmlns:cx4="http://schemas.microsoft.com/office/drawing/2016/5/10/chartex" xmlns:cx3="http://schemas.microsoft.com/office/drawing/2016/5/9/chartex" xmlns:cx2="http://schemas.microsoft.com/office/drawing/2015/10/21/chartex" xmlns:cx1="http://schemas.microsoft.com/office/drawing/2015/9/8/chartex" xmlns:cx="http://schemas.microsoft.com/office/drawing/2014/chartex">
             <w:pict>
               <v:shape w14:anchorId="3338C0D8" id="_x0000_s1029" type="#_x0000_t202" style="position:absolute;margin-left:240.5pt;margin-top:255.85pt;width:329.8pt;height:37.4pt;z-index:251669504;visibility:visible;mso-wrap-style:square;mso-width-percent:0;mso-height-percent:0;mso-wrap-distance-left:9pt;mso-wrap-distance-top:3.6pt;mso-wrap-distance-right:9pt;mso-wrap-distance-bottom:3.6pt;mso-position-horizontal:absolute;mso-position-horizontal-relative:page;mso-position-vertical:absolute;mso-position-vertical-relative:text;mso-width-percent:0;mso-height-percent:0;mso-width-relative:margin;mso-height-relative:margin;v-text-anchor:top" o:gfxdata="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" filled="f" stroked="f">
                 <v:textbox>
@@ -632,7 +618,7 @@
               </wp:anchor>
             </w:drawing>
           </mc:Choice>
-          <mc:Fallback>
+          <mc:Fallback xmlns:w16se="http://schemas.microsoft.com/office/word/2015/wordml/symex" xmlns:w16sdtfl="http://schemas.microsoft.com/office/word/2024/wordml/sdtformatlock" xmlns:w16sdtdh="http://schemas.microsoft.com/office/word/2020/wordml/sdtdatahash" xmlns:w16du="http://schemas.microsoft.com/office/word/2023/wordml/word16du" xmlns:w16="http://schemas.microsoft.com/office/word/2018/wordml" xmlns:w16cid="http://schemas.microsoft.com/office/word/2016/wordml/cid" xmlns:w16cex="http://schemas.microsoft.com/office/word/2018/wordml/cex" xmlns:oel="http://schemas.microsoft.com/office/2019/extlst" xmlns:am3d="http://schemas.microsoft.com/office/drawing/2017/model3d" xmlns:aink="http://schemas.microsoft.com/office/drawing/2016/ink" xmlns:cx8="http://schemas.microsoft.com/office/drawing/2016/5/14/chartex" xmlns:cx7="http://schemas.microsoft.com/office/drawing/2016/5/13/chartex" xmlns:cx6="http://schemas.microsoft.com/office/drawing/2016/5/12/chartex" xmlns:cx5="http://schemas.microsoft.com/office/drawing/2016/5/11/chartex" xmlns:cx4="http://schemas.microsoft.com/office/drawing/2016/5/10/chartex" xmlns:cx3="http://schemas.microsoft.com/office/drawing/2016/5/9/chartex" xmlns:cx2="http://schemas.microsoft.com/office/drawing/2015/10/21/chartex" xmlns:cx1="http://schemas.microsoft.com/office/drawing/2015/9/8/chartex" xmlns:cx="http://schemas.microsoft.com/office/drawing/2014/chartex">
             <w:pict>
               <v:shapetype w14:anchorId="7868344C" id="_x0000_t202" coordsize="21600,21600" o:spt="202" path="m,l,21600r21600,l21600,xe">
                 <v:stroke joinstyle="miter"/>
@@ -751,7 +737,7 @@
               </wp:anchor>
             </w:drawing>
           </mc:Choice>
-          <mc:Fallback>
+          <mc:Fallback xmlns:w16se="http://schemas.microsoft.com/office/word/2015/wordml/symex" xmlns:w16sdtfl="http://schemas.microsoft.com/office/word/2024/wordml/sdtformatlock" xmlns:w16sdtdh="http://schemas.microsoft.com/office/word/2020/wordml/sdtdatahash" xmlns:w16du="http://schemas.microsoft.com/office/word/2023/wordml/word16du" xmlns:w16="http://schemas.microsoft.com/office/word/2018/wordml" xmlns:w16cid="http://schemas.microsoft.com/office/word/2016/wordml/cid" xmlns:w16cex="http://schemas.microsoft.com/office/word/2018/wordml/cex" xmlns:oel="http://schemas.microsoft.com/office/2019/extlst" xmlns:am3d="http://schemas.microsoft.com/office/drawing/2017/model3d" xmlns:aink="http://schemas.microsoft.com/office/drawing/2016/ink" xmlns:cx8="http://schemas.microsoft.com/office/drawing/2016/5/14/chartex" xmlns:cx7="http://schemas.microsoft.com/office/drawing/2016/5/13/chartex" xmlns:cx6="http://schemas.microsoft.com/office/drawing/2016/5/12/chartex" xmlns:cx5="http://schemas.microsoft.com/office/drawing/2016/5/11/chartex" xmlns:cx4="http://schemas.microsoft.com/office/drawing/2016/5/10/chartex" xmlns:cx3="http://schemas.microsoft.com/office/drawing/2016/5/9/chartex" xmlns:cx2="http://schemas.microsoft.com/office/drawing/2015/10/21/chartex" xmlns:cx1="http://schemas.microsoft.com/office/drawing/2015/9/8/chartex" xmlns:cx="http://schemas.microsoft.com/office/drawing/2014/chartex">
             <w:pict>
               <v:shape w14:anchorId="53C6E124" id="_x0000_s1032" type="#_x0000_t202" style="position:absolute;margin-left:0;margin-top:298.55pt;width:166.65pt;height:45.3pt;z-index:251666432;visibility:visible;mso-wrap-style:square;mso-width-percent:0;mso-height-percent:0;mso-wrap-distance-left:9pt;mso-wrap-distance-top:3.6pt;mso-wrap-distance-right:9pt;mso-wrap-distance-bottom:3.6pt;mso-position-horizontal:left;mso-position-horizontal-relative:margin;mso-position-vertical:absolute;mso-position-vertical-relative:text;mso-width-percent:0;mso-height-percent:0;mso-width-relative:margin;mso-height-relative:margin;v-text-anchor:top" o:gfxdata="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" filled="f" stroked="f">
                 <v:textbox>
@@ -866,7 +852,7 @@
               </wp:anchor>
             </w:drawing>
           </mc:Choice>
-          <mc:Fallback>
+          <mc:Fallback xmlns:w16se="http://schemas.microsoft.com/office/word/2015/wordml/symex" xmlns:w16sdtfl="http://schemas.microsoft.com/office/word/2024/wordml/sdtformatlock" xmlns:w16sdtdh="http://schemas.microsoft.com/office/word/2020/wordml/sdtdatahash" xmlns:w16du="http://schemas.microsoft.com/office/word/2023/wordml/word16du" xmlns:w16="http://schemas.microsoft.com/office/word/2018/wordml" xmlns:w16cid="http://schemas.microsoft.com/office/word/2016/wordml/cid" xmlns:w16cex="http://schemas.microsoft.com/office/word/2018/wordml/cex" xmlns:oel="http://schemas.microsoft.com/office/2019/extlst" xmlns:am3d="http://schemas.microsoft.com/office/drawing/2017/model3d" xmlns:aink="http://schemas.microsoft.com/office/drawing/2016/ink" xmlns:cx8="http://schemas.microsoft.com/office/drawing/2016/5/14/chartex" xmlns:cx7="http://schemas.microsoft.com/office/drawing/2016/5/13/chartex" xmlns:cx6="http://schemas.microsoft.com/office/drawing/2016/5/12/chartex" xmlns:cx5="http://schemas.microsoft.com/office/drawing/2016/5/11/chartex" xmlns:cx4="http://schemas.microsoft.com/office/drawing/2016/5/10/chartex" xmlns:cx3="http://schemas.microsoft.com/office/drawing/2016/5/9/chartex" xmlns:cx2="http://schemas.microsoft.com/office/drawing/2015/10/21/chartex" xmlns:cx1="http://schemas.microsoft.com/office/drawing/2015/9/8/chartex" xmlns:cx="http://schemas.microsoft.com/office/drawing/2014/chartex">
             <w:pict>
               <v:shape w14:anchorId="1F1A65A0" id="_x0000_s1033" type="#_x0000_t202" style="position:absolute;margin-left:0;margin-top:347.1pt;width:166.65pt;height:45.3pt;z-index:251667456;visibility:visible;mso-wrap-style:square;mso-width-percent:0;mso-height-percent:0;mso-wrap-distance-left:9pt;mso-wrap-distance-top:3.6pt;mso-wrap-distance-right:9pt;mso-wrap-distance-bottom:3.6pt;mso-position-horizontal:left;mso-position-horizontal-relative:margin;mso-position-vertical:absolute;mso-position-vertical-relative:text;mso-width-percent:0;mso-height-percent:0;mso-width-relative:margin;mso-height-relative:margin;v-text-anchor:top" o:gfxdata="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" filled="f" stroked="f">
                 <v:textbox>
@@ -901,6 +887,7 @@
       <w:r>
         <w:rPr>
           <w:noProof/>
+          <w:lang w:eastAsia="es-MX"/>
         </w:rPr>
         <w:drawing>
           <wp:anchor distT="0" distB="0" distL="114300" distR="114300" simplePos="0" relativeHeight="251664384" behindDoc="1" locked="0" layoutInCell="1" allowOverlap="1" wp14:anchorId="2DF8D9E7" wp14:editId="3ECC30CF">
@@ -1019,7 +1006,7 @@
                                 <w:sz w:val="40"/>
                                 <w:szCs w:val="36"/>
                               </w:rPr>
-                              <w:t>31/02/25</w:t>
+                              <w:t>22/3/6</w:t>
                             </w:r>
                           </w:p>
                         </w:txbxContent>
@@ -1041,7 +1028,7 @@
           </mc:Choice>
           <mc:Fallback>
             <w:pict>
-              <v:shape w14:anchorId="3A795063" id="_x0000_s1034" type="#_x0000_t202" style="position:absolute;margin-left:237.8pt;margin-top:565.4pt;width:311.8pt;height:45.3pt;z-index:251678720;visibility:visible;mso-wrap-style:square;mso-width-percent:0;mso-height-percent:0;mso-wrap-distance-left:9pt;mso-wrap-distance-top:3.6pt;mso-wrap-distance-right:9pt;mso-wrap-distance-bottom:3.6pt;mso-position-horizontal:absolute;mso-position-horizontal-relative:page;mso-position-vertical:absolute;mso-position-vertical-relative:text;mso-width-percent:0;mso-height-percent:0;mso-width-relative:margin;mso-height-relative:margin;v-text-anchor:top" o:gfxdata="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" filled="f" stroked="f">
+              <v:shape w14:anchorId="3A795063" id="_x0000_s1033" type="#_x0000_t202" style="position:absolute;margin-left:237.8pt;margin-top:565.4pt;width:311.8pt;height:45.3pt;z-index:251678720;visibility:visible;mso-wrap-style:square;mso-width-percent:0;mso-height-percent:0;mso-wrap-distance-left:9pt;mso-wrap-distance-top:3.6pt;mso-wrap-distance-right:9pt;mso-wrap-distance-bottom:3.6pt;mso-position-horizontal:absolute;mso-position-horizontal-relative:page;mso-position-vertical:absolute;mso-position-vertical-relative:text;mso-width-percent:0;mso-height-percent:0;mso-width-relative:margin;mso-height-relative:margin;v-text-anchor:top" o:gfxdata="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" filled="f" stroked="f">
                 <v:textbox>
                   <w:txbxContent>
                     <w:p>
@@ -1058,7 +1045,7 @@
                           <w:sz w:val="40"/>
                           <w:szCs w:val="36"/>
                         </w:rPr>
-                        <w:t>31/02/25</w:t>
+                        <w:t>22/3/6</w:t>
                       </w:r>
                     </w:p>
                   </w:txbxContent>
@@ -1130,7 +1117,7 @@
                                 <w:sz w:val="40"/>
                                 <w:szCs w:val="36"/>
                               </w:rPr>
-                              <w:t>Nombre del docente de la materia</w:t>
+                              <w:t>Raymundo Said Zamora Pequeño</w:t>
                             </w:r>
                           </w:p>
                         </w:txbxContent>
@@ -1152,7 +1139,7 @@
           </mc:Choice>
           <mc:Fallback>
             <w:pict>
-              <v:shape w14:anchorId="39D76FC2" id="_x0000_s1035" type="#_x0000_t202" style="position:absolute;margin-left:237.6pt;margin-top:514.3pt;width:349.2pt;height:45.3pt;z-index:251677696;visibility:visible;mso-wrap-style:square;mso-width-percent:0;mso-height-percent:0;mso-wrap-distance-left:9pt;mso-wrap-distance-top:3.6pt;mso-wrap-distance-right:9pt;mso-wrap-distance-bottom:3.6pt;mso-position-horizontal:absolute;mso-position-horizontal-relative:page;mso-position-vertical:absolute;mso-position-vertical-relative:text;mso-width-percent:0;mso-height-percent:0;mso-width-relative:margin;mso-height-relative:margin;v-text-anchor:top" o:gfxdata="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" filled="f" stroked="f">
+              <v:shape w14:anchorId="39D76FC2" id="_x0000_s1034" type="#_x0000_t202" style="position:absolute;margin-left:237.6pt;margin-top:514.3pt;width:349.2pt;height:45.3pt;z-index:251677696;visibility:visible;mso-wrap-style:square;mso-width-percent:0;mso-height-percent:0;mso-wrap-distance-left:9pt;mso-wrap-distance-top:3.6pt;mso-wrap-distance-right:9pt;mso-wrap-distance-bottom:3.6pt;mso-position-horizontal:absolute;mso-position-horizontal-relative:page;mso-position-vertical:absolute;mso-position-vertical-relative:text;mso-width-percent:0;mso-height-percent:0;mso-width-relative:margin;mso-height-relative:margin;v-text-anchor:top" o:gfxdata="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" filled="f" stroked="f">
                 <v:textbox>
                   <w:txbxContent>
                     <w:p>
@@ -1169,7 +1156,7 @@
                           <w:sz w:val="40"/>
                           <w:szCs w:val="36"/>
                         </w:rPr>
-                        <w:t>Nombre del docente de la materia</w:t>
+                        <w:t>Raymundo Said Zamora Pequeño</w:t>
                       </w:r>
                     </w:p>
                   </w:txbxContent>
@@ -1188,118 +1175,7 @@
         <mc:AlternateContent>
           <mc:Choice Requires="wps">
             <w:drawing>
-              <wp:anchor distT="45720" distB="45720" distL="114300" distR="114300" simplePos="0" relativeHeight="251672576" behindDoc="0" locked="0" layoutInCell="1" allowOverlap="1" wp14:anchorId="79BA0080" wp14:editId="6FB22D93">
-                <wp:simplePos x="0" y="0"/>
-                <wp:positionH relativeFrom="page">
-                  <wp:posOffset>3020060</wp:posOffset>
-                </wp:positionH>
-                <wp:positionV relativeFrom="paragraph">
-                  <wp:posOffset>5792470</wp:posOffset>
-                </wp:positionV>
-                <wp:extent cx="3959860" cy="575310"/>
-                <wp:effectExtent l="0" t="0" r="0" b="0"/>
-                <wp:wrapSquare wrapText="bothSides"/>
-                <wp:docPr id="19" name="Cuadro de texto 2"/>
-                <wp:cNvGraphicFramePr>
-                  <a:graphicFrameLocks xmlns:a="http://schemas.openxmlformats.org/drawingml/2006/main"/>
-                </wp:cNvGraphicFramePr>
-                <a:graphic xmlns:a="http://schemas.openxmlformats.org/drawingml/2006/main">
-                  <a:graphicData uri="http://schemas.microsoft.com/office/word/2010/wordprocessingShape">
-                    <wps:wsp>
-                      <wps:cNvSpPr txBox="1">
-                        <a:spLocks noChangeArrowheads="1"/>
-                      </wps:cNvSpPr>
-                      <wps:spPr bwMode="auto">
-                        <a:xfrm>
-                          <a:off x="0" y="0"/>
-                          <a:ext cx="3959860" cy="575310"/>
-                        </a:xfrm>
-                        <a:prstGeom prst="rect">
-                          <a:avLst/>
-                        </a:prstGeom>
-                        <a:noFill/>
-                        <a:ln w="9525">
-                          <a:noFill/>
-                          <a:miter lim="800000"/>
-                          <a:headEnd/>
-                          <a:tailEnd/>
-                        </a:ln>
-                      </wps:spPr>
-                      <wps:txbx>
-                        <w:txbxContent>
-                          <w:p>
-                            <w:pPr>
-                              <w:rPr>
-                                <w:rFonts w:ascii="Arial" w:hAnsi="Arial" w:cs="Arial"/>
-                                <w:sz w:val="40"/>
-                                <w:szCs w:val="36"/>
-                              </w:rPr>
-                            </w:pPr>
-                            <w:r>
-                              <w:rPr>
-                                <w:rFonts w:ascii="Arial" w:hAnsi="Arial" w:cs="Arial"/>
-                                <w:sz w:val="40"/>
-                                <w:szCs w:val="36"/>
-                              </w:rPr>
-                              <w:t>Nombre de la materia</w:t>
-                            </w:r>
-                          </w:p>
-                        </w:txbxContent>
-                      </wps:txbx>
-                      <wps:bodyPr rot="0" vert="horz" wrap="square" lIns="91440" tIns="45720" rIns="91440" bIns="45720" anchor="t" anchorCtr="0">
-                        <a:noAutofit/>
-                      </wps:bodyPr>
-                    </wps:wsp>
-                  </a:graphicData>
-                </a:graphic>
-                <wp14:sizeRelH relativeFrom="margin">
-                  <wp14:pctWidth>0</wp14:pctWidth>
-                </wp14:sizeRelH>
-                <wp14:sizeRelV relativeFrom="margin">
-                  <wp14:pctHeight>0</wp14:pctHeight>
-                </wp14:sizeRelV>
-              </wp:anchor>
-            </w:drawing>
-          </mc:Choice>
-          <mc:Fallback>
-            <w:pict>
-              <v:shape w14:anchorId="79BA0080" id="_x0000_s1036" type="#_x0000_t202" style="position:absolute;margin-left:237.8pt;margin-top:456.1pt;width:311.8pt;height:45.3pt;z-index:251672576;visibility:visible;mso-wrap-style:square;mso-width-percent:0;mso-height-percent:0;mso-wrap-distance-left:9pt;mso-wrap-distance-top:3.6pt;mso-wrap-distance-right:9pt;mso-wrap-distance-bottom:3.6pt;mso-position-horizontal:absolute;mso-position-horizontal-relative:page;mso-position-vertical:absolute;mso-position-vertical-relative:text;mso-width-percent:0;mso-height-percent:0;mso-width-relative:margin;mso-height-relative:margin;v-text-anchor:top" o:gfxdata="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" filled="f" stroked="f">
-                <v:textbox>
-                  <w:txbxContent>
-                    <w:p>
-                      <w:pPr>
-                        <w:rPr>
-                          <w:rFonts w:ascii="Arial" w:hAnsi="Arial" w:cs="Arial"/>
-                          <w:sz w:val="40"/>
-                          <w:szCs w:val="36"/>
-                        </w:rPr>
-                      </w:pPr>
-                      <w:r>
-                        <w:rPr>
-                          <w:rFonts w:ascii="Arial" w:hAnsi="Arial" w:cs="Arial"/>
-                          <w:sz w:val="40"/>
-                          <w:szCs w:val="36"/>
-                        </w:rPr>
-                        <w:t>Nombre de la materia</w:t>
-                      </w:r>
-                    </w:p>
-                  </w:txbxContent>
-                </v:textbox>
-                <w10:wrap type="square" anchorx="page"/>
-              </v:shape>
-            </w:pict>
-          </mc:Fallback>
-        </mc:AlternateContent>
-      </w:r>
-      <w:r>
-        <w:rPr>
-          <w:noProof/>
-          <w:lang w:eastAsia="es-MX"/>
-        </w:rPr>
-        <mc:AlternateContent>
-          <mc:Choice Requires="wps">
-            <w:drawing>
-              <wp:anchor distT="45720" distB="45720" distL="114300" distR="114300" simplePos="0" relativeHeight="251681792" behindDoc="0" locked="0" layoutInCell="1" allowOverlap="1" wp14:anchorId="218B6301" wp14:editId="7B61E7EA">
+              <wp:anchor distT="45720" distB="45720" distL="114300" distR="114300" simplePos="0" relativeHeight="251681792" behindDoc="0" locked="0" layoutInCell="1" allowOverlap="1" wp14:anchorId="218B6301" wp14:editId="6482ECED">
                 <wp:simplePos x="0" y="0"/>
                 <wp:positionH relativeFrom="page">
                   <wp:posOffset>3020060</wp:posOffset>
@@ -1374,7 +1250,7 @@
           </mc:Choice>
           <mc:Fallback>
             <w:pict>
-              <v:shape w14:anchorId="218B6301" id="_x0000_s1037" type="#_x0000_t202" style="position:absolute;margin-left:237.8pt;margin-top:406.7pt;width:311.8pt;height:45.3pt;z-index:251681792;visibility:visible;mso-wrap-style:square;mso-width-percent:0;mso-height-percent:0;mso-wrap-distance-left:9pt;mso-wrap-distance-top:3.6pt;mso-wrap-distance-right:9pt;mso-wrap-distance-bottom:3.6pt;mso-position-horizontal:absolute;mso-position-horizontal-relative:page;mso-position-vertical:absolute;mso-position-vertical-relative:text;mso-width-percent:0;mso-height-percent:0;mso-width-relative:margin;mso-height-relative:margin;v-text-anchor:top" o:gfxdata="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" filled="f" stroked="f">
+              <v:shape w14:anchorId="218B6301" id="_x0000_s1035" type="#_x0000_t202" style="position:absolute;margin-left:237.8pt;margin-top:406.7pt;width:311.8pt;height:45.3pt;z-index:251681792;visibility:visible;mso-wrap-style:square;mso-width-percent:0;mso-height-percent:0;mso-wrap-distance-left:9pt;mso-wrap-distance-top:3.6pt;mso-wrap-distance-right:9pt;mso-wrap-distance-bottom:3.6pt;mso-position-horizontal:absolute;mso-position-horizontal-relative:page;mso-position-vertical:absolute;mso-position-vertical-relative:text;mso-width-percent:0;mso-height-percent:0;mso-width-relative:margin;mso-height-relative:margin;v-text-anchor:top" o:gfxdata="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" filled="f" stroked="f">
                 <v:textbox>
                   <w:txbxContent>
                     <w:p>
@@ -1485,7 +1361,7 @@
               </wp:anchor>
             </w:drawing>
           </mc:Choice>
-          <mc:Fallback>
+          <mc:Fallback xmlns:w16se="http://schemas.microsoft.com/office/word/2015/wordml/symex" xmlns:w16sdtfl="http://schemas.microsoft.com/office/word/2024/wordml/sdtformatlock" xmlns:w16sdtdh="http://schemas.microsoft.com/office/word/2020/wordml/sdtdatahash" xmlns:w16du="http://schemas.microsoft.com/office/word/2023/wordml/word16du" xmlns:w16="http://schemas.microsoft.com/office/word/2018/wordml" xmlns:w16cid="http://schemas.microsoft.com/office/word/2016/wordml/cid" xmlns:w16cex="http://schemas.microsoft.com/office/word/2018/wordml/cex" xmlns:oel="http://schemas.microsoft.com/office/2019/extlst" xmlns:am3d="http://schemas.microsoft.com/office/drawing/2017/model3d" xmlns:aink="http://schemas.microsoft.com/office/drawing/2016/ink" xmlns:cx8="http://schemas.microsoft.com/office/drawing/2016/5/14/chartex" xmlns:cx7="http://schemas.microsoft.com/office/drawing/2016/5/13/chartex" xmlns:cx6="http://schemas.microsoft.com/office/drawing/2016/5/12/chartex" xmlns:cx5="http://schemas.microsoft.com/office/drawing/2016/5/11/chartex" xmlns:cx4="http://schemas.microsoft.com/office/drawing/2016/5/10/chartex" xmlns:cx3="http://schemas.microsoft.com/office/drawing/2016/5/9/chartex" xmlns:cx2="http://schemas.microsoft.com/office/drawing/2015/10/21/chartex" xmlns:cx1="http://schemas.microsoft.com/office/drawing/2015/9/8/chartex" xmlns:cx="http://schemas.microsoft.com/office/drawing/2014/chartex">
             <w:pict>
               <v:shape w14:anchorId="760AF1F1" id="_x0000_s1038" type="#_x0000_t202" style="position:absolute;margin-left:0;margin-top:397.15pt;width:166.65pt;height:45.3pt;z-index:251680768;visibility:visible;mso-wrap-style:square;mso-width-percent:0;mso-height-percent:0;mso-wrap-distance-left:9pt;mso-wrap-distance-top:3.6pt;mso-wrap-distance-right:9pt;mso-wrap-distance-bottom:3.6pt;mso-position-horizontal:left;mso-position-horizontal-relative:margin;mso-position-vertical:absolute;mso-position-vertical-relative:text;mso-width-percent:0;mso-height-percent:0;mso-width-relative:margin;mso-height-relative:margin;v-text-anchor:top" o:gfxdata="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" filled="f" stroked="f">
                 <v:textbox>
@@ -1600,7 +1476,7 @@
               </wp:anchor>
             </w:drawing>
           </mc:Choice>
-          <mc:Fallback>
+          <mc:Fallback xmlns:w16se="http://schemas.microsoft.com/office/word/2015/wordml/symex" xmlns:w16sdtfl="http://schemas.microsoft.com/office/word/2024/wordml/sdtformatlock" xmlns:w16sdtdh="http://schemas.microsoft.com/office/word/2020/wordml/sdtdatahash" xmlns:w16du="http://schemas.microsoft.com/office/word/2023/wordml/word16du" xmlns:w16="http://schemas.microsoft.com/office/word/2018/wordml" xmlns:w16cid="http://schemas.microsoft.com/office/word/2016/wordml/cid" xmlns:w16cex="http://schemas.microsoft.com/office/word/2018/wordml/cex" xmlns:oel="http://schemas.microsoft.com/office/2019/extlst" xmlns:am3d="http://schemas.microsoft.com/office/drawing/2017/model3d" xmlns:aink="http://schemas.microsoft.com/office/drawing/2016/ink" xmlns:cx8="http://schemas.microsoft.com/office/drawing/2016/5/14/chartex" xmlns:cx7="http://schemas.microsoft.com/office/drawing/2016/5/13/chartex" xmlns:cx6="http://schemas.microsoft.com/office/drawing/2016/5/12/chartex" xmlns:cx5="http://schemas.microsoft.com/office/drawing/2016/5/11/chartex" xmlns:cx4="http://schemas.microsoft.com/office/drawing/2016/5/10/chartex" xmlns:cx3="http://schemas.microsoft.com/office/drawing/2016/5/9/chartex" xmlns:cx2="http://schemas.microsoft.com/office/drawing/2015/10/21/chartex" xmlns:cx1="http://schemas.microsoft.com/office/drawing/2015/9/8/chartex" xmlns:cx="http://schemas.microsoft.com/office/drawing/2014/chartex">
             <w:pict>
               <v:shape w14:anchorId="57498611" id="_x0000_s1039" type="#_x0000_t202" style="position:absolute;margin-left:0;margin-top:454.3pt;width:166.65pt;height:50.4pt;z-index:251668480;visibility:visible;mso-wrap-style:square;mso-width-percent:0;mso-height-percent:0;mso-wrap-distance-left:9pt;mso-wrap-distance-top:3.6pt;mso-wrap-distance-right:9pt;mso-wrap-distance-bottom:3.6pt;mso-position-horizontal:left;mso-position-horizontal-relative:margin;mso-position-vertical:absolute;mso-position-vertical-relative:text;mso-width-percent:0;mso-height-percent:0;mso-width-relative:margin;mso-height-relative:margin;v-text-anchor:top" o:gfxdata="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" filled="f" stroked="f">
                 <v:textbox>
@@ -1715,7 +1591,7 @@
               </wp:anchor>
             </w:drawing>
           </mc:Choice>
-          <mc:Fallback>
+          <mc:Fallback xmlns:w16se="http://schemas.microsoft.com/office/word/2015/wordml/symex" xmlns:w16sdtfl="http://schemas.microsoft.com/office/word/2024/wordml/sdtformatlock" xmlns:w16sdtdh="http://schemas.microsoft.com/office/word/2020/wordml/sdtdatahash" xmlns:w16du="http://schemas.microsoft.com/office/word/2023/wordml/word16du" xmlns:w16="http://schemas.microsoft.com/office/word/2018/wordml" xmlns:w16cid="http://schemas.microsoft.com/office/word/2016/wordml/cid" xmlns:w16cex="http://schemas.microsoft.com/office/word/2018/wordml/cex" xmlns:oel="http://schemas.microsoft.com/office/2019/extlst" xmlns:am3d="http://schemas.microsoft.com/office/drawing/2017/model3d" xmlns:aink="http://schemas.microsoft.com/office/drawing/2016/ink" xmlns:cx8="http://schemas.microsoft.com/office/drawing/2016/5/14/chartex" xmlns:cx7="http://schemas.microsoft.com/office/drawing/2016/5/13/chartex" xmlns:cx6="http://schemas.microsoft.com/office/drawing/2016/5/12/chartex" xmlns:cx5="http://schemas.microsoft.com/office/drawing/2016/5/11/chartex" xmlns:cx4="http://schemas.microsoft.com/office/drawing/2016/5/10/chartex" xmlns:cx3="http://schemas.microsoft.com/office/drawing/2016/5/9/chartex" xmlns:cx2="http://schemas.microsoft.com/office/drawing/2015/10/21/chartex" xmlns:cx1="http://schemas.microsoft.com/office/drawing/2015/9/8/chartex" xmlns:cx="http://schemas.microsoft.com/office/drawing/2014/chartex">
             <w:pict>
               <v:shape w14:anchorId="0551B988" id="_x0000_s1040" type="#_x0000_t202" style="position:absolute;margin-left:1.4pt;margin-top:558.25pt;width:102pt;height:52.6pt;z-index:251675648;visibility:visible;mso-wrap-style:square;mso-width-percent:0;mso-height-percent:0;mso-wrap-distance-left:9pt;mso-wrap-distance-top:3.6pt;mso-wrap-distance-right:9pt;mso-wrap-distance-bottom:3.6pt;mso-position-horizontal:absolute;mso-position-horizontal-relative:margin;mso-position-vertical:absolute;mso-position-vertical-relative:text;mso-width-percent:0;mso-height-percent:0;mso-width-relative:margin;mso-height-relative:margin;v-text-anchor:top" o:gfxdata="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" filled="f" stroked="f">
                 <v:textbox>
@@ -1830,7 +1706,7 @@
               </wp:anchor>
             </w:drawing>
           </mc:Choice>
-          <mc:Fallback>
+          <mc:Fallback xmlns:w16se="http://schemas.microsoft.com/office/word/2015/wordml/symex" xmlns:w16sdtfl="http://schemas.microsoft.com/office/word/2024/wordml/sdtformatlock" xmlns:w16sdtdh="http://schemas.microsoft.com/office/word/2020/wordml/sdtdatahash" xmlns:w16du="http://schemas.microsoft.com/office/word/2023/wordml/word16du" xmlns:w16="http://schemas.microsoft.com/office/word/2018/wordml" xmlns:w16cid="http://schemas.microsoft.com/office/word/2016/wordml/cid" xmlns:w16cex="http://schemas.microsoft.com/office/word/2018/wordml/cex" xmlns:oel="http://schemas.microsoft.com/office/2019/extlst" xmlns:am3d="http://schemas.microsoft.com/office/drawing/2017/model3d" xmlns:aink="http://schemas.microsoft.com/office/drawing/2016/ink" xmlns:cx8="http://schemas.microsoft.com/office/drawing/2016/5/14/chartex" xmlns:cx7="http://schemas.microsoft.com/office/drawing/2016/5/13/chartex" xmlns:cx6="http://schemas.microsoft.com/office/drawing/2016/5/12/chartex" xmlns:cx5="http://schemas.microsoft.com/office/drawing/2016/5/11/chartex" xmlns:cx4="http://schemas.microsoft.com/office/drawing/2016/5/10/chartex" xmlns:cx3="http://schemas.microsoft.com/office/drawing/2016/5/9/chartex" xmlns:cx2="http://schemas.microsoft.com/office/drawing/2015/10/21/chartex" xmlns:cx1="http://schemas.microsoft.com/office/drawing/2015/9/8/chartex" xmlns:cx="http://schemas.microsoft.com/office/drawing/2014/chartex">
             <w:pict>
               <v:shape w14:anchorId="6932118A" id="_x0000_s1041" type="#_x0000_t202" style="position:absolute;margin-left:0;margin-top:505.55pt;width:166.65pt;height:45.3pt;z-index:251676672;visibility:visible;mso-wrap-style:square;mso-width-percent:0;mso-height-percent:0;mso-wrap-distance-left:9pt;mso-wrap-distance-top:3.6pt;mso-wrap-distance-right:9pt;mso-wrap-distance-bottom:3.6pt;mso-position-horizontal:left;mso-position-horizontal-relative:margin;mso-position-vertical:absolute;mso-position-vertical-relative:text;mso-width-percent:0;mso-height-percent:0;mso-width-relative:margin;mso-height-relative:margin;v-text-anchor:top" o:gfxdata="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" filled="f" stroked="f">
                 <v:textbox>
@@ -1875,6 +1751,117 @@
           <w14:ligatures w14:val="none"/>
         </w:rPr>
       </w:pPr>
+      <w:r>
+        <w:rPr>
+          <w:noProof/>
+          <w:lang w:eastAsia="es-MX"/>
+        </w:rPr>
+        <mc:AlternateContent>
+          <mc:Choice Requires="wps">
+            <w:drawing>
+              <wp:anchor distT="45720" distB="45720" distL="114300" distR="114300" simplePos="0" relativeHeight="251672576" behindDoc="0" locked="0" layoutInCell="1" allowOverlap="1" wp14:anchorId="79BA0080" wp14:editId="3DB54EB5">
+                <wp:simplePos x="0" y="0"/>
+                <wp:positionH relativeFrom="page">
+                  <wp:posOffset>3019425</wp:posOffset>
+                </wp:positionH>
+                <wp:positionV relativeFrom="paragraph">
+                  <wp:posOffset>5384800</wp:posOffset>
+                </wp:positionV>
+                <wp:extent cx="3959860" cy="800100"/>
+                <wp:effectExtent l="0" t="0" r="0" b="0"/>
+                <wp:wrapSquare wrapText="bothSides"/>
+                <wp:docPr id="19" name="Cuadro de texto 2"/>
+                <wp:cNvGraphicFramePr>
+                  <a:graphicFrameLocks xmlns:a="http://schemas.openxmlformats.org/drawingml/2006/main"/>
+                </wp:cNvGraphicFramePr>
+                <a:graphic xmlns:a="http://schemas.openxmlformats.org/drawingml/2006/main">
+                  <a:graphicData uri="http://schemas.microsoft.com/office/word/2010/wordprocessingShape">
+                    <wps:wsp>
+                      <wps:cNvSpPr txBox="1">
+                        <a:spLocks noChangeArrowheads="1"/>
+                      </wps:cNvSpPr>
+                      <wps:spPr bwMode="auto">
+                        <a:xfrm>
+                          <a:off x="0" y="0"/>
+                          <a:ext cx="3959860" cy="800100"/>
+                        </a:xfrm>
+                        <a:prstGeom prst="rect">
+                          <a:avLst/>
+                        </a:prstGeom>
+                        <a:noFill/>
+                        <a:ln w="9525">
+                          <a:noFill/>
+                          <a:miter lim="800000"/>
+                          <a:headEnd/>
+                          <a:tailEnd/>
+                        </a:ln>
+                      </wps:spPr>
+                      <wps:txbx>
+                        <w:txbxContent>
+                          <w:p>
+                            <w:pPr>
+                              <w:rPr>
+                                <w:rFonts w:ascii="Arial" w:hAnsi="Arial" w:cs="Arial"/>
+                                <w:sz w:val="40"/>
+                                <w:szCs w:val="36"/>
+                              </w:rPr>
+                            </w:pPr>
+                            <w:r>
+                              <w:rPr>
+                                <w:rFonts w:ascii="Arial" w:hAnsi="Arial" w:cs="Arial"/>
+                                <w:sz w:val="40"/>
+                                <w:szCs w:val="36"/>
+                              </w:rPr>
+                              <w:t>Tópicos Selectos de Ciencia de la Ing. III</w:t>
+                            </w:r>
+                          </w:p>
+                        </w:txbxContent>
+                      </wps:txbx>
+                      <wps:bodyPr rot="0" vert="horz" wrap="square" lIns="91440" tIns="45720" rIns="91440" bIns="45720" anchor="t" anchorCtr="0">
+                        <a:noAutofit/>
+                      </wps:bodyPr>
+                    </wps:wsp>
+                  </a:graphicData>
+                </a:graphic>
+                <wp14:sizeRelH relativeFrom="margin">
+                  <wp14:pctWidth>0</wp14:pctWidth>
+                </wp14:sizeRelH>
+                <wp14:sizeRelV relativeFrom="margin">
+                  <wp14:pctHeight>0</wp14:pctHeight>
+                </wp14:sizeRelV>
+              </wp:anchor>
+            </w:drawing>
+          </mc:Choice>
+          <mc:Fallback>
+            <w:pict>
+              <v:shape w14:anchorId="79BA0080" id="_x0000_s1040" type="#_x0000_t202" style="position:absolute;margin-left:237.75pt;margin-top:424pt;width:311.8pt;height:63pt;z-index:251672576;visibility:visible;mso-wrap-style:square;mso-width-percent:0;mso-height-percent:0;mso-wrap-distance-left:9pt;mso-wrap-distance-top:3.6pt;mso-wrap-distance-right:9pt;mso-wrap-distance-bottom:3.6pt;mso-position-horizontal:absolute;mso-position-horizontal-relative:page;mso-position-vertical:absolute;mso-position-vertical-relative:text;mso-width-percent:0;mso-height-percent:0;mso-width-relative:margin;mso-height-relative:margin;v-text-anchor:top" o:gfxdata="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" filled="f" stroked="f">
+                <v:textbox>
+                  <w:txbxContent>
+                    <w:p>
+                      <w:pPr>
+                        <w:rPr>
+                          <w:rFonts w:ascii="Arial" w:hAnsi="Arial" w:cs="Arial"/>
+                          <w:sz w:val="40"/>
+                          <w:szCs w:val="36"/>
+                        </w:rPr>
+                      </w:pPr>
+                      <w:r>
+                        <w:rPr>
+                          <w:rFonts w:ascii="Arial" w:hAnsi="Arial" w:cs="Arial"/>
+                          <w:sz w:val="40"/>
+                          <w:szCs w:val="36"/>
+                        </w:rPr>
+                        <w:t>Tópicos Selectos de Ciencia de la Ing. III</w:t>
+                      </w:r>
+                    </w:p>
+                  </w:txbxContent>
+                </v:textbox>
+                <w10:wrap type="square" anchorx="page"/>
+              </v:shape>
+            </w:pict>
+          </mc:Fallback>
+        </mc:AlternateContent>
+      </w:r>
       <w:r>
         <w:rPr>
           <w:noProof/>
@@ -1956,7 +1943,7 @@
               </wp:anchor>
             </w:drawing>
           </mc:Choice>
-          <mc:Fallback>
+          <mc:Fallback xmlns:w16se="http://schemas.microsoft.com/office/word/2015/wordml/symex" xmlns:w16sdtfl="http://schemas.microsoft.com/office/word/2024/wordml/sdtformatlock" xmlns:w16sdtdh="http://schemas.microsoft.com/office/word/2020/wordml/sdtdatahash" xmlns:w16du="http://schemas.microsoft.com/office/word/2023/wordml/word16du" xmlns:w16="http://schemas.microsoft.com/office/word/2018/wordml" xmlns:w16cid="http://schemas.microsoft.com/office/word/2016/wordml/cid" xmlns:w16cex="http://schemas.microsoft.com/office/word/2018/wordml/cex" xmlns:oel="http://schemas.microsoft.com/office/2019/extlst" xmlns:am3d="http://schemas.microsoft.com/office/drawing/2017/model3d" xmlns:aink="http://schemas.microsoft.com/office/drawing/2016/ink" xmlns:cx8="http://schemas.microsoft.com/office/drawing/2016/5/14/chartex" xmlns:cx7="http://schemas.microsoft.com/office/drawing/2016/5/13/chartex" xmlns:cx6="http://schemas.microsoft.com/office/drawing/2016/5/12/chartex" xmlns:cx5="http://schemas.microsoft.com/office/drawing/2016/5/11/chartex" xmlns:cx4="http://schemas.microsoft.com/office/drawing/2016/5/10/chartex" xmlns:cx3="http://schemas.microsoft.com/office/drawing/2016/5/9/chartex" xmlns:cx2="http://schemas.microsoft.com/office/drawing/2015/10/21/chartex" xmlns:cx1="http://schemas.microsoft.com/office/drawing/2015/9/8/chartex" xmlns:cx="http://schemas.microsoft.com/office/drawing/2014/chartex">
             <w:pict>
               <v:shape w14:anchorId="0E3E9F36" id="_x0000_s1041" type="#_x0000_t202" style="position:absolute;margin-left:169.05pt;margin-top:277.2pt;width:311.8pt;height:30.85pt;z-index:251670528;visibility:visible;mso-wrap-style:square;mso-width-percent:0;mso-height-percent:0;mso-wrap-distance-left:9pt;mso-wrap-distance-top:3.6pt;mso-wrap-distance-right:9pt;mso-wrap-distance-bottom:3.6pt;mso-position-horizontal:absolute;mso-position-horizontal-relative:margin;mso-position-vertical:absolute;mso-position-vertical-relative:text;mso-width-percent:0;mso-height-percent:0;mso-width-relative:margin;mso-height-relative:margin;v-text-anchor:top" o:gfxdata="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" filled="f" stroked="f">
                 <v:textbox>
@@ -2047,7 +2034,7 @@
                                 <w:sz w:val="40"/>
                                 <w:szCs w:val="36"/>
                               </w:rPr>
-                              <w:t>000</w:t>
+                              <w:t>507</w:t>
                             </w:r>
                           </w:p>
                         </w:txbxContent>
@@ -2069,7 +2056,7 @@
           </mc:Choice>
           <mc:Fallback>
             <w:pict>
-              <v:shape w14:anchorId="136D9EF9" id="_x0000_s1042" type="#_x0000_t202" style="position:absolute;margin-left:250.3pt;margin-top:328pt;width:301.5pt;height:45.3pt;z-index:251671552;visibility:visible;mso-wrap-style:square;mso-width-percent:0;mso-height-percent:0;mso-wrap-distance-left:9pt;mso-wrap-distance-top:3.6pt;mso-wrap-distance-right:9pt;mso-wrap-distance-bottom:3.6pt;mso-position-horizontal:right;mso-position-horizontal-relative:margin;mso-position-vertical:absolute;mso-position-vertical-relative:text;mso-width-percent:0;mso-height-percent:0;mso-width-relative:margin;mso-height-relative:margin;v-text-anchor:top" o:gfxdata="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" filled="f" stroked="f">
+              <v:shape w14:anchorId="136D9EF9" id="_x0000_s1042" type="#_x0000_t202" style="position:absolute;margin-left:250.3pt;margin-top:328pt;width:301.5pt;height:45.3pt;z-index:251671552;visibility:visible;mso-wrap-style:square;mso-width-percent:0;mso-height-percent:0;mso-wrap-distance-left:9pt;mso-wrap-distance-top:3.6pt;mso-wrap-distance-right:9pt;mso-wrap-distance-bottom:3.6pt;mso-position-horizontal:right;mso-position-horizontal-relative:margin;mso-position-vertical:absolute;mso-position-vertical-relative:text;mso-width-percent:0;mso-height-percent:0;mso-width-relative:margin;mso-height-relative:margin;v-text-anchor:top" o:gfxdata="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" filled="f" stroked="f">
                 <v:textbox>
                   <w:txbxContent>
                     <w:p>
@@ -2086,7 +2073,7 @@
                           <w:sz w:val="40"/>
                           <w:szCs w:val="36"/>
                         </w:rPr>
-                        <w:t>000</w:t>
+                        <w:t>507</w:t>
                       </w:r>
                     </w:p>
                   </w:txbxContent>
@@ -2127,7 +2114,7 @@
       <w:sdtContent>
         <w:p>
           <w:pPr>
-            <w:pStyle w:val="TtuloTDC"/>
+            <w:pStyle w:val="TtulodeTDC"/>
           </w:pPr>
           <w:r>
             <w:t>Contenido</w:t>
@@ -2140,7 +2127,13 @@
               <w:tab w:val="right" w:leader="dot" w:pos="9350"/>
             </w:tabs>
             <w:rPr>
+              <w:rFonts w:eastAsiaTheme="minorEastAsia"/>
               <w:noProof/>
+              <w:kern w:val="0"/>
+              <w:sz w:val="22"/>
+              <w:szCs w:val="22"/>
+              <w:lang w:eastAsia="es-MX"/>
+              <w14:ligatures w14:val="none"/>
             </w:rPr>
           </w:pPr>
           <w:r>
@@ -2152,13 +2145,13 @@
           <w:r>
             <w:fldChar w:fldCharType="separate"/>
           </w:r>
-          <w:hyperlink w:anchor="_Toc223370974" w:history="1">
+          <w:hyperlink w:anchor="_Toc224999469" w:history="1">
             <w:r>
               <w:rPr>
                 <w:rStyle w:val="Hipervnculo"/>
                 <w:noProof/>
               </w:rPr>
-              <w:t>1.1 - 3 Indicadores del World Bank Open Data y su relación con el objetivo.</w:t>
+              <w:t>Objetivo</w:t>
             </w:r>
             <w:r>
               <w:rPr>
@@ -2179,7 +2172,169 @@
                 <w:noProof/>
                 <w:webHidden/>
               </w:rPr>
-              <w:instrText xml:space="preserve"> PAGEREF _Toc223370974 \h </w:instrText>
+              <w:instrText xml:space="preserve"> PAGEREF _Toc224999469 \h </w:instrText>
+            </w:r>
+            <w:r>
+              <w:rPr>
+                <w:noProof/>
+                <w:webHidden/>
+              </w:rPr>
+            </w:r>
+            <w:r>
+              <w:rPr>
+                <w:noProof/>
+                <w:webHidden/>
+              </w:rPr>
+              <w:fldChar w:fldCharType="separate"/>
+            </w:r>
+            <w:r>
+              <w:rPr>
+                <w:noProof/>
+                <w:webHidden/>
+              </w:rPr>
+              <w:t>3</w:t>
+            </w:r>
+            <w:r>
+              <w:rPr>
+                <w:noProof/>
+                <w:webHidden/>
+              </w:rPr>
+              <w:fldChar w:fldCharType="end"/>
+            </w:r>
+          </w:hyperlink>
+        </w:p>
+        <w:p>
+          <w:pPr>
+            <w:pStyle w:val="TDC1"/>
+            <w:tabs>
+              <w:tab w:val="right" w:leader="dot" w:pos="9350"/>
+            </w:tabs>
+            <w:rPr>
+              <w:rFonts w:eastAsiaTheme="minorEastAsia"/>
+              <w:noProof/>
+              <w:kern w:val="0"/>
+              <w:sz w:val="22"/>
+              <w:szCs w:val="22"/>
+              <w:lang w:eastAsia="es-MX"/>
+              <w14:ligatures w14:val="none"/>
+            </w:rPr>
+          </w:pPr>
+          <w:hyperlink w:anchor="_Toc224999470" w:history="1">
+            <w:r>
+              <w:rPr>
+                <w:rStyle w:val="Hipervnculo"/>
+                <w:noProof/>
+              </w:rPr>
+              <w:t xml:space="preserve">Marco </w:t>
+            </w:r>
+            <w:r>
+              <w:rPr>
+                <w:rStyle w:val="Hipervnculo"/>
+                <w:noProof/>
+              </w:rPr>
+              <w:t>t</w:t>
+            </w:r>
+            <w:r>
+              <w:rPr>
+                <w:rStyle w:val="Hipervnculo"/>
+                <w:noProof/>
+              </w:rPr>
+              <w:t>eórico</w:t>
+            </w:r>
+            <w:r>
+              <w:rPr>
+                <w:noProof/>
+                <w:webHidden/>
+              </w:rPr>
+              <w:tab/>
+            </w:r>
+            <w:r>
+              <w:rPr>
+                <w:noProof/>
+                <w:webHidden/>
+              </w:rPr>
+              <w:fldChar w:fldCharType="begin"/>
+            </w:r>
+            <w:r>
+              <w:rPr>
+                <w:noProof/>
+                <w:webHidden/>
+              </w:rPr>
+              <w:instrText xml:space="preserve"> PAGEREF _Toc224999470 \h </w:instrText>
+            </w:r>
+            <w:r>
+              <w:rPr>
+                <w:noProof/>
+                <w:webHidden/>
+              </w:rPr>
+            </w:r>
+            <w:r>
+              <w:rPr>
+                <w:noProof/>
+                <w:webHidden/>
+              </w:rPr>
+              <w:fldChar w:fldCharType="separate"/>
+            </w:r>
+            <w:r>
+              <w:rPr>
+                <w:noProof/>
+                <w:webHidden/>
+              </w:rPr>
+              <w:t>3</w:t>
+            </w:r>
+            <w:r>
+              <w:rPr>
+                <w:noProof/>
+                <w:webHidden/>
+              </w:rPr>
+              <w:fldChar w:fldCharType="end"/>
+            </w:r>
+          </w:hyperlink>
+        </w:p>
+        <w:p>
+          <w:pPr>
+            <w:pStyle w:val="TDC1"/>
+            <w:tabs>
+              <w:tab w:val="right" w:leader="dot" w:pos="9350"/>
+            </w:tabs>
+            <w:rPr>
+              <w:rFonts w:eastAsiaTheme="minorEastAsia"/>
+              <w:noProof/>
+              <w:kern w:val="0"/>
+              <w:sz w:val="22"/>
+              <w:szCs w:val="22"/>
+              <w:lang w:eastAsia="es-MX"/>
+              <w14:ligatures w14:val="none"/>
+            </w:rPr>
+          </w:pPr>
+          <w:hyperlink w:anchor="_Toc224999471" w:history="1">
+            <w:r>
+              <w:rPr>
+                <w:rStyle w:val="Hipervnculo"/>
+                <w:noProof/>
+              </w:rPr>
+              <w:t>3 Indicadores del World Bank Open Data y su relación con el objetivo.</w:t>
+            </w:r>
+            <w:r>
+              <w:rPr>
+                <w:noProof/>
+                <w:webHidden/>
+              </w:rPr>
+              <w:tab/>
+            </w:r>
+            <w:r>
+              <w:rPr>
+                <w:noProof/>
+                <w:webHidden/>
+              </w:rPr>
+              <w:fldChar w:fldCharType="begin"/>
+            </w:r>
+            <w:r>
+              <w:rPr>
+                <w:noProof/>
+                <w:webHidden/>
+              </w:rPr>
+              <w:instrText xml:space="preserve"> PAGEREF _Toc224999471 \h </w:instrText>
             </w:r>
             <w:r>
               <w:rPr>
@@ -2217,10 +2372,16 @@
               <w:tab w:val="right" w:leader="dot" w:pos="9350"/>
             </w:tabs>
             <w:rPr>
+              <w:rFonts w:eastAsiaTheme="minorEastAsia"/>
               <w:noProof/>
+              <w:kern w:val="0"/>
+              <w:sz w:val="22"/>
+              <w:szCs w:val="22"/>
+              <w:lang w:eastAsia="es-MX"/>
+              <w14:ligatures w14:val="none"/>
             </w:rPr>
           </w:pPr>
-          <w:hyperlink w:anchor="_Toc223370975" w:history="1">
+          <w:hyperlink w:anchor="_Toc224999472" w:history="1">
             <w:r>
               <w:rPr>
                 <w:rStyle w:val="Hipervnculo"/>
@@ -2247,7 +2408,7 @@
                 <w:noProof/>
                 <w:webHidden/>
               </w:rPr>
-              <w:instrText xml:space="preserve"> PAGEREF _Toc223370975 \h </w:instrText>
+              <w:instrText xml:space="preserve"> PAGEREF _Toc224999472 \h </w:instrText>
             </w:r>
             <w:r>
               <w:rPr>
@@ -2285,10 +2446,16 @@
               <w:tab w:val="right" w:leader="dot" w:pos="9350"/>
             </w:tabs>
             <w:rPr>
+              <w:rFonts w:eastAsiaTheme="minorEastAsia"/>
               <w:noProof/>
+              <w:kern w:val="0"/>
+              <w:sz w:val="22"/>
+              <w:szCs w:val="22"/>
+              <w:lang w:eastAsia="es-MX"/>
+              <w14:ligatures w14:val="none"/>
             </w:rPr>
           </w:pPr>
-          <w:hyperlink w:anchor="_Toc223370976" w:history="1">
+          <w:hyperlink w:anchor="_Toc224999473" w:history="1">
             <w:r>
               <w:rPr>
                 <w:rStyle w:val="Hipervnculo"/>
@@ -2315,7 +2482,7 @@
                 <w:noProof/>
                 <w:webHidden/>
               </w:rPr>
-              <w:instrText xml:space="preserve"> PAGEREF _Toc223370976 \h </w:instrText>
+              <w:instrText xml:space="preserve"> PAGEREF _Toc224999473 \h </w:instrText>
             </w:r>
             <w:r>
               <w:rPr>
@@ -2335,7 +2502,7 @@
                 <w:noProof/>
                 <w:webHidden/>
               </w:rPr>
-              <w:t>5</w:t>
+              <w:t>6</w:t>
             </w:r>
             <w:r>
               <w:rPr>
@@ -2353,10 +2520,16 @@
               <w:tab w:val="right" w:leader="dot" w:pos="9350"/>
             </w:tabs>
             <w:rPr>
+              <w:rFonts w:eastAsiaTheme="minorEastAsia"/>
               <w:noProof/>
+              <w:kern w:val="0"/>
+              <w:sz w:val="22"/>
+              <w:szCs w:val="22"/>
+              <w:lang w:eastAsia="es-MX"/>
+              <w14:ligatures w14:val="none"/>
             </w:rPr>
           </w:pPr>
-          <w:hyperlink w:anchor="_Toc223370977" w:history="1">
+          <w:hyperlink w:anchor="_Toc224999474" w:history="1">
             <w:r>
               <w:rPr>
                 <w:rStyle w:val="Hipervnculo"/>
@@ -2383,7 +2556,7 @@
                 <w:noProof/>
                 <w:webHidden/>
               </w:rPr>
-              <w:instrText xml:space="preserve"> PAGEREF _Toc223370977 \h </w:instrText>
+              <w:instrText xml:space="preserve"> PAGEREF _Toc224999474 \h </w:instrText>
             </w:r>
             <w:r>
               <w:rPr>
@@ -2403,7 +2576,7 @@
                 <w:noProof/>
                 <w:webHidden/>
               </w:rPr>
-              <w:t>5</w:t>
+              <w:t>6</w:t>
             </w:r>
             <w:r>
               <w:rPr>
@@ -2421,10 +2594,16 @@
               <w:tab w:val="right" w:leader="dot" w:pos="9350"/>
             </w:tabs>
             <w:rPr>
+              <w:rFonts w:eastAsiaTheme="minorEastAsia"/>
               <w:noProof/>
+              <w:kern w:val="0"/>
+              <w:sz w:val="22"/>
+              <w:szCs w:val="22"/>
+              <w:lang w:eastAsia="es-MX"/>
+              <w14:ligatures w14:val="none"/>
             </w:rPr>
           </w:pPr>
-          <w:hyperlink w:anchor="_Toc223370978" w:history="1">
+          <w:hyperlink w:anchor="_Toc224999475" w:history="1">
             <w:r>
               <w:rPr>
                 <w:rStyle w:val="Hipervnculo"/>
@@ -2452,7 +2631,7 @@
                 <w:noProof/>
                 <w:webHidden/>
               </w:rPr>
-              <w:instrText xml:space="preserve"> PAGEREF _Toc223370978 \h </w:instrText>
+              <w:instrText xml:space="preserve"> PAGEREF _Toc224999475 \h </w:instrText>
             </w:r>
             <w:r>
               <w:rPr>
@@ -2490,10 +2669,16 @@
               <w:tab w:val="right" w:leader="dot" w:pos="9350"/>
             </w:tabs>
             <w:rPr>
+              <w:rFonts w:eastAsiaTheme="minorEastAsia"/>
               <w:noProof/>
+              <w:kern w:val="0"/>
+              <w:sz w:val="22"/>
+              <w:szCs w:val="22"/>
+              <w:lang w:eastAsia="es-MX"/>
+              <w14:ligatures w14:val="none"/>
             </w:rPr>
           </w:pPr>
-          <w:hyperlink w:anchor="_Toc223370979" w:history="1">
+          <w:hyperlink w:anchor="_Toc224999476" w:history="1">
             <w:r>
               <w:rPr>
                 <w:rStyle w:val="Hipervnculo"/>
@@ -2520,7 +2705,7 @@
                 <w:noProof/>
                 <w:webHidden/>
               </w:rPr>
-              <w:instrText xml:space="preserve"> PAGEREF _Toc223370979 \h </w:instrText>
+              <w:instrText xml:space="preserve"> PAGEREF _Toc224999476 \h </w:instrText>
             </w:r>
             <w:r>
               <w:rPr>
@@ -2558,10 +2743,16 @@
               <w:tab w:val="right" w:leader="dot" w:pos="9350"/>
             </w:tabs>
             <w:rPr>
+              <w:rFonts w:eastAsiaTheme="minorEastAsia"/>
               <w:noProof/>
+              <w:kern w:val="0"/>
+              <w:sz w:val="22"/>
+              <w:szCs w:val="22"/>
+              <w:lang w:eastAsia="es-MX"/>
+              <w14:ligatures w14:val="none"/>
             </w:rPr>
           </w:pPr>
-          <w:hyperlink w:anchor="_Toc223370980" w:history="1">
+          <w:hyperlink w:anchor="_Toc224999477" w:history="1">
             <w:r>
               <w:rPr>
                 <w:rStyle w:val="Hipervnculo"/>
@@ -2588,7 +2779,7 @@
                 <w:noProof/>
                 <w:webHidden/>
               </w:rPr>
-              <w:instrText xml:space="preserve"> PAGEREF _Toc223370980 \h </w:instrText>
+              <w:instrText xml:space="preserve"> PAGEREF _Toc224999477 \h </w:instrText>
             </w:r>
             <w:r>
               <w:rPr>
@@ -2608,7 +2799,7 @@
                 <w:noProof/>
                 <w:webHidden/>
               </w:rPr>
-              <w:t>6</w:t>
+              <w:t>7</w:t>
             </w:r>
             <w:r>
               <w:rPr>
@@ -2626,10 +2817,16 @@
               <w:tab w:val="right" w:leader="dot" w:pos="9350"/>
             </w:tabs>
             <w:rPr>
+              <w:rFonts w:eastAsiaTheme="minorEastAsia"/>
               <w:noProof/>
+              <w:kern w:val="0"/>
+              <w:sz w:val="22"/>
+              <w:szCs w:val="22"/>
+              <w:lang w:eastAsia="es-MX"/>
+              <w14:ligatures w14:val="none"/>
             </w:rPr>
           </w:pPr>
-          <w:hyperlink w:anchor="_Toc223370981" w:history="1">
+          <w:hyperlink w:anchor="_Toc224999478" w:history="1">
             <w:r>
               <w:rPr>
                 <w:rStyle w:val="Hipervnculo"/>
@@ -2656,7 +2853,7 @@
                 <w:noProof/>
                 <w:webHidden/>
               </w:rPr>
-              <w:instrText xml:space="preserve"> PAGEREF _Toc223370981 \h </w:instrText>
+              <w:instrText xml:space="preserve"> PAGEREF _Toc224999478 \h </w:instrText>
             </w:r>
             <w:r>
               <w:rPr>
@@ -2676,7 +2873,7 @@
                 <w:noProof/>
                 <w:webHidden/>
               </w:rPr>
-              <w:t>6</w:t>
+              <w:t>7</w:t>
             </w:r>
             <w:r>
               <w:rPr>
@@ -2694,10 +2891,16 @@
               <w:tab w:val="right" w:leader="dot" w:pos="9350"/>
             </w:tabs>
             <w:rPr>
+              <w:rFonts w:eastAsiaTheme="minorEastAsia"/>
               <w:noProof/>
+              <w:kern w:val="0"/>
+              <w:sz w:val="22"/>
+              <w:szCs w:val="22"/>
+              <w:lang w:eastAsia="es-MX"/>
+              <w14:ligatures w14:val="none"/>
             </w:rPr>
           </w:pPr>
-          <w:hyperlink w:anchor="_Toc223370982" w:history="1">
+          <w:hyperlink w:anchor="_Toc224999479" w:history="1">
             <w:r>
               <w:rPr>
                 <w:rStyle w:val="Hipervnculo"/>
@@ -2724,7 +2927,7 @@
                 <w:noProof/>
                 <w:webHidden/>
               </w:rPr>
-              <w:instrText xml:space="preserve"> PAGEREF _Toc223370982 \h </w:instrText>
+              <w:instrText xml:space="preserve"> PAGEREF _Toc224999479 \h </w:instrText>
             </w:r>
             <w:r>
               <w:rPr>
@@ -2744,7 +2947,7 @@
                 <w:noProof/>
                 <w:webHidden/>
               </w:rPr>
-              <w:t>7</w:t>
+              <w:t>8</w:t>
             </w:r>
             <w:r>
               <w:rPr>
@@ -2762,10 +2965,16 @@
               <w:tab w:val="right" w:leader="dot" w:pos="9350"/>
             </w:tabs>
             <w:rPr>
+              <w:rFonts w:eastAsiaTheme="minorEastAsia"/>
               <w:noProof/>
+              <w:kern w:val="0"/>
+              <w:sz w:val="22"/>
+              <w:szCs w:val="22"/>
+              <w:lang w:eastAsia="es-MX"/>
+              <w14:ligatures w14:val="none"/>
             </w:rPr>
           </w:pPr>
-          <w:hyperlink w:anchor="_Toc223370983" w:history="1">
+          <w:hyperlink w:anchor="_Toc224999480" w:history="1">
             <w:r>
               <w:rPr>
                 <w:rStyle w:val="Hipervnculo"/>
@@ -2792,7 +3001,7 @@
                 <w:noProof/>
                 <w:webHidden/>
               </w:rPr>
-              <w:instrText xml:space="preserve"> PAGEREF _Toc223370983 \h </w:instrText>
+              <w:instrText xml:space="preserve"> PAGEREF _Toc224999480 \h </w:instrText>
             </w:r>
             <w:r>
               <w:rPr>
@@ -2812,7 +3021,7 @@
                 <w:noProof/>
                 <w:webHidden/>
               </w:rPr>
-              <w:t>7</w:t>
+              <w:t>8</w:t>
             </w:r>
             <w:r>
               <w:rPr>
@@ -2830,10 +3039,16 @@
               <w:tab w:val="right" w:leader="dot" w:pos="9350"/>
             </w:tabs>
             <w:rPr>
+              <w:rFonts w:eastAsiaTheme="minorEastAsia"/>
               <w:noProof/>
+              <w:kern w:val="0"/>
+              <w:sz w:val="22"/>
+              <w:szCs w:val="22"/>
+              <w:lang w:eastAsia="es-MX"/>
+              <w14:ligatures w14:val="none"/>
             </w:rPr>
           </w:pPr>
-          <w:hyperlink w:anchor="_Toc223370984" w:history="1">
+          <w:hyperlink w:anchor="_Toc224999481" w:history="1">
             <w:r>
               <w:rPr>
                 <w:rStyle w:val="Hipervnculo"/>
@@ -2860,7 +3075,7 @@
                 <w:noProof/>
                 <w:webHidden/>
               </w:rPr>
-              <w:instrText xml:space="preserve"> PAGEREF _Toc223370984 \h </w:instrText>
+              <w:instrText xml:space="preserve"> PAGEREF _Toc224999481 \h </w:instrText>
             </w:r>
             <w:r>
               <w:rPr>
@@ -2880,7 +3095,7 @@
                 <w:noProof/>
                 <w:webHidden/>
               </w:rPr>
-              <w:t>11</w:t>
+              <w:t>12</w:t>
             </w:r>
             <w:r>
               <w:rPr>
@@ -2919,11 +3134,12 @@
       <w:pPr>
         <w:pStyle w:val="Ttulo1"/>
       </w:pPr>
-      <w:bookmarkStart w:id="0" w:name="_Toc223370974"/>
+      <w:bookmarkStart w:id="0" w:name="_Toc224999469"/>
       <w:r>
         <w:lastRenderedPageBreak/>
         <w:t>Objetivo</w:t>
       </w:r>
+      <w:bookmarkEnd w:id="0"/>
     </w:p>
     <w:p>
       <w:r>
@@ -2934,9 +3150,13 @@
       <w:pPr>
         <w:pStyle w:val="Ttulo1"/>
       </w:pPr>
+      <w:bookmarkStart w:id="1" w:name="_Toc224999470"/>
+      <w:bookmarkStart w:id="2" w:name="_GoBack"/>
+      <w:bookmarkEnd w:id="2"/>
       <w:r>
         <w:t>Marco teórico</w:t>
       </w:r>
+      <w:bookmarkEnd w:id="1"/>
     </w:p>
     <w:p>
       <w:r>
@@ -3043,18 +3263,11 @@
       <w:pPr>
         <w:pStyle w:val="Ttulo1"/>
       </w:pPr>
-      <w:r>
-        <w:t xml:space="preserve">3 </w:t>
-      </w:r>
-      <w:proofErr w:type="gramStart"/>
-      <w:r>
-        <w:t>Indicadores</w:t>
-      </w:r>
-      <w:proofErr w:type="gramEnd"/>
-      <w:r>
-        <w:t xml:space="preserve"> del World Bank Open Data y su relación con el objetivo.</w:t>
-      </w:r>
-      <w:bookmarkEnd w:id="0"/>
+      <w:bookmarkStart w:id="3" w:name="_Toc224999471"/>
+      <w:r>
+        <w:t>3 Indicadores del World Bank Open Data y su relación con el objetivo.</w:t>
+      </w:r>
+      <w:bookmarkEnd w:id="3"/>
     </w:p>
     <w:p>
       <w:r>
@@ -3100,11 +3313,19 @@
           <w:lang w:val="en-US"/>
         </w:rPr>
       </w:pPr>
+      <w:proofErr w:type="spellStart"/>
       <w:r>
         <w:rPr>
           <w:lang w:val="en-US"/>
         </w:rPr>
-        <w:t xml:space="preserve">PIB per </w:t>
+        <w:t>PIB</w:t>
+      </w:r>
+      <w:proofErr w:type="spellEnd"/>
+      <w:r>
+        <w:rPr>
+          <w:lang w:val="en-US"/>
+        </w:rPr>
+        <w:t xml:space="preserve"> per </w:t>
       </w:r>
       <w:proofErr w:type="spellStart"/>
       <w:r>
@@ -3118,8 +3339,16 @@
         <w:rPr>
           <w:lang w:val="en-US"/>
         </w:rPr>
-        <w:t xml:space="preserve"> (US$) - NY.GDP.PCAP.CD</w:t>
-      </w:r>
+        <w:t xml:space="preserve"> (US$) - </w:t>
+      </w:r>
+      <w:proofErr w:type="spellStart"/>
+      <w:r>
+        <w:rPr>
+          <w:lang w:val="en-US"/>
+        </w:rPr>
+        <w:t>NY.GDP.PCAP.CD</w:t>
+      </w:r>
+      <w:proofErr w:type="spellEnd"/>
     </w:p>
     <w:p>
       <w:r>
@@ -3141,11 +3370,11 @@
       <w:pPr>
         <w:pStyle w:val="Ttulo2"/>
       </w:pPr>
-      <w:bookmarkStart w:id="1" w:name="_Toc223370975"/>
+      <w:bookmarkStart w:id="4" w:name="_Toc224999472"/>
       <w:r>
         <w:t>1.2 – Desarrollo</w:t>
       </w:r>
-      <w:bookmarkEnd w:id="1"/>
+      <w:bookmarkEnd w:id="4"/>
     </w:p>
     <w:p>
       <w:r>
@@ -3157,7 +3386,15 @@
       </w:r>
       <w:proofErr w:type="spellEnd"/>
       <w:r>
-        <w:t xml:space="preserve"> CSV son un desastre. </w:t>
+        <w:t xml:space="preserve"> </w:t>
+      </w:r>
+      <w:proofErr w:type="spellStart"/>
+      <w:r>
+        <w:t>CSV</w:t>
+      </w:r>
+      <w:proofErr w:type="spellEnd"/>
+      <w:r>
+        <w:t xml:space="preserve"> son un desastre. </w:t>
       </w:r>
     </w:p>
     <w:p>
@@ -3210,7 +3447,6 @@
     </w:p>
     <w:p>
       <w:r>
-        <w:lastRenderedPageBreak/>
         <w:t xml:space="preserve">Inicio creando 3 </w:t>
       </w:r>
       <w:proofErr w:type="spellStart"/>
@@ -3230,7 +3466,9 @@
       <w:r>
         <w:rPr>
           <w:noProof/>
-        </w:rPr>
+          <w:lang w:eastAsia="es-MX"/>
+        </w:rPr>
+        <w:lastRenderedPageBreak/>
         <w:drawing>
           <wp:inline distT="0" distB="0" distL="0" distR="0" wp14:anchorId="375A9C9E" wp14:editId="5B07267D">
             <wp:extent cx="4495800" cy="422202"/>
@@ -3321,7 +3559,15 @@
       </w:r>
       <w:r>
         <w:br/>
-        <w:t xml:space="preserve">Para el CSV de </w:t>
+        <w:t xml:space="preserve">Para el </w:t>
+      </w:r>
+      <w:proofErr w:type="spellStart"/>
+      <w:r>
+        <w:t>CSV</w:t>
+      </w:r>
+      <w:proofErr w:type="spellEnd"/>
+      <w:r>
+        <w:t xml:space="preserve"> de </w:t>
       </w:r>
       <w:proofErr w:type="spellStart"/>
       <w:r>
@@ -3347,6 +3593,7 @@
       <w:r>
         <w:rPr>
           <w:noProof/>
+          <w:lang w:eastAsia="es-MX"/>
         </w:rPr>
         <w:drawing>
           <wp:inline distT="0" distB="0" distL="0" distR="0" wp14:anchorId="0B95C961" wp14:editId="7B57E7CB">
@@ -3454,6 +3701,7 @@
       <w:r>
         <w:rPr>
           <w:noProof/>
+          <w:lang w:eastAsia="es-MX"/>
         </w:rPr>
         <w:drawing>
           <wp:inline distT="0" distB="0" distL="0" distR="0" wp14:anchorId="23593EC1" wp14:editId="015C3A04">
@@ -3509,6 +3757,7 @@
       <w:r>
         <w:rPr>
           <w:noProof/>
+          <w:lang w:eastAsia="es-MX"/>
         </w:rPr>
         <w:drawing>
           <wp:inline distT="0" distB="0" distL="0" distR="0" wp14:anchorId="05467B41" wp14:editId="3902E2D3">
@@ -3553,11 +3802,11 @@
       </w:r>
       <w:proofErr w:type="gramStart"/>
       <w:r>
-        <w:t>tercer columna</w:t>
+        <w:t>tercer</w:t>
       </w:r>
       <w:proofErr w:type="gramEnd"/>
       <w:r>
-        <w:t>, utilizando como índice en común la columna “País”.</w:t>
+        <w:t xml:space="preserve"> columna, utilizando como índice en común la columna “País”.</w:t>
       </w:r>
       <w:r>
         <w:t xml:space="preserve"> Otra alternativa hubiera sido crear un </w:t>
@@ -3580,7 +3829,6 @@
         <w:t>data.frame</w:t>
       </w:r>
       <w:proofErr w:type="spellEnd"/>
-      <w:proofErr w:type="gramEnd"/>
       <w:r>
         <w:rPr>
           <w:i/>
@@ -3589,6 +3837,7 @@
         <w:t>(</w:t>
       </w:r>
       <w:proofErr w:type="spellStart"/>
+      <w:proofErr w:type="gramEnd"/>
       <w:r>
         <w:rPr>
           <w:i/>
@@ -3612,8 +3861,8 @@
       <w:r>
         <w:rPr>
           <w:noProof/>
-        </w:rPr>
-        <w:lastRenderedPageBreak/>
+          <w:lang w:eastAsia="es-MX"/>
+        </w:rPr>
         <w:drawing>
           <wp:inline distT="0" distB="0" distL="0" distR="0" wp14:anchorId="344008BB" wp14:editId="179BC8F9">
             <wp:extent cx="3848637" cy="219106"/>
@@ -3653,6 +3902,7 @@
     </w:p>
     <w:p>
       <w:r>
+        <w:lastRenderedPageBreak/>
         <w:t>Eliminamos las filas que tengan “NA” (Datos vacíos) para que no estorben el análisis.</w:t>
       </w:r>
     </w:p>
@@ -4313,6 +4563,7 @@
       <w:r>
         <w:rPr>
           <w:noProof/>
+          <w:lang w:eastAsia="es-MX"/>
         </w:rPr>
         <w:drawing>
           <wp:inline distT="0" distB="0" distL="0" distR="0" wp14:anchorId="06625970" wp14:editId="24A100DB">
@@ -4370,12 +4621,12 @@
       <w:pPr>
         <w:pStyle w:val="Ttulo2"/>
       </w:pPr>
-      <w:bookmarkStart w:id="2" w:name="_Toc223370976"/>
+      <w:bookmarkStart w:id="5" w:name="_Toc224999473"/>
       <w:r>
         <w:lastRenderedPageBreak/>
         <w:t>Conclusiones y resultados</w:t>
       </w:r>
-      <w:bookmarkEnd w:id="2"/>
+      <w:bookmarkEnd w:id="5"/>
     </w:p>
     <w:p>
       <w:pPr>
@@ -4404,6 +4655,7 @@
           <w:b/>
           <w:bCs/>
           <w:noProof/>
+          <w:lang w:eastAsia="es-MX"/>
         </w:rPr>
         <w:drawing>
           <wp:inline distT="0" distB="0" distL="0" distR="0" wp14:anchorId="4063F97A" wp14:editId="5666961C">
@@ -4501,6 +4753,7 @@
           <w:b/>
           <w:bCs/>
           <w:noProof/>
+          <w:lang w:eastAsia="es-MX"/>
         </w:rPr>
         <w:drawing>
           <wp:inline distT="0" distB="0" distL="0" distR="0" wp14:anchorId="761C77C2" wp14:editId="4C7A26DE">
@@ -4553,15 +4806,7 @@
         <w:t xml:space="preserve">No realmente. </w:t>
       </w:r>
       <w:r>
-        <w:t xml:space="preserve">De </w:t>
-      </w:r>
-      <w:proofErr w:type="gramStart"/>
-      <w:r>
-        <w:t>hecho</w:t>
-      </w:r>
-      <w:proofErr w:type="gramEnd"/>
-      <w:r>
-        <w:t xml:space="preserve"> hay una correlación es </w:t>
+        <w:t xml:space="preserve">De hecho hay una correlación es </w:t>
       </w:r>
       <w:r>
         <w:rPr>
@@ -4601,11 +4846,11 @@
       <w:pPr>
         <w:pStyle w:val="Ttulo2"/>
       </w:pPr>
-      <w:bookmarkStart w:id="3" w:name="_Toc223370977"/>
+      <w:bookmarkStart w:id="6" w:name="_Toc224999474"/>
       <w:r>
         <w:t>Conclusión</w:t>
       </w:r>
-      <w:bookmarkEnd w:id="3"/>
+      <w:bookmarkEnd w:id="6"/>
     </w:p>
     <w:p>
       <w:r>
@@ -4619,12 +4864,11 @@
           <w:lang w:val="es-ES"/>
         </w:rPr>
       </w:pPr>
-      <w:bookmarkStart w:id="4" w:name="_Toc223370978"/>
+      <w:bookmarkStart w:id="7" w:name="_Toc224999475"/>
       <w:r>
         <w:rPr>
           <w:lang w:val="es-ES"/>
         </w:rPr>
-        <w:lastRenderedPageBreak/>
         <w:t xml:space="preserve">2.1.- </w:t>
       </w:r>
       <w:proofErr w:type="spellStart"/>
@@ -4683,7 +4927,7 @@
         </w:rPr>
         <w:t>) para un objetivo elegido.</w:t>
       </w:r>
-      <w:bookmarkEnd w:id="4"/>
+      <w:bookmarkEnd w:id="7"/>
     </w:p>
     <w:p>
       <w:pPr>
@@ -4694,7 +4938,7 @@
           <w:szCs w:val="32"/>
         </w:rPr>
       </w:pPr>
-      <w:bookmarkStart w:id="5" w:name="_Toc223370979"/>
+      <w:bookmarkStart w:id="8" w:name="_Toc224999476"/>
       <w:r>
         <w:rPr>
           <w:rStyle w:val="Ttulo1Car"/>
@@ -4748,6 +4992,7 @@
         <w:rPr>
           <w:rStyle w:val="Ttulo1Car"/>
         </w:rPr>
+        <w:lastRenderedPageBreak/>
         <w:t>dataset</w:t>
       </w:r>
       <w:proofErr w:type="spellEnd"/>
@@ -4757,7 +5002,7 @@
         </w:rPr>
         <w:t xml:space="preserve"> que haga una aproximación</w:t>
       </w:r>
-      <w:bookmarkEnd w:id="5"/>
+      <w:bookmarkEnd w:id="8"/>
       <w:r>
         <w:rPr>
           <w:rStyle w:val="Ttulo1Car"/>
@@ -4783,11 +5028,11 @@
           <w:szCs w:val="22"/>
         </w:rPr>
       </w:pPr>
-      <w:bookmarkStart w:id="6" w:name="_Toc223370980"/>
+      <w:bookmarkStart w:id="9" w:name="_Toc224999477"/>
       <w:r>
         <w:t>3.1.1 - Objetivo:</w:t>
       </w:r>
-      <w:bookmarkEnd w:id="6"/>
+      <w:bookmarkEnd w:id="9"/>
     </w:p>
     <w:p>
       <w:r>
@@ -4803,11 +5048,11 @@
           <w:szCs w:val="22"/>
         </w:rPr>
       </w:pPr>
-      <w:bookmarkStart w:id="7" w:name="_Toc223370981"/>
+      <w:bookmarkStart w:id="10" w:name="_Toc224999478"/>
       <w:r>
         <w:t>3.1.2 Exploración de los datos</w:t>
       </w:r>
-      <w:bookmarkEnd w:id="7"/>
+      <w:bookmarkEnd w:id="10"/>
     </w:p>
     <w:p>
       <w:pPr>
@@ -4840,6 +5085,7 @@
         <w:t>head(</w:t>
       </w:r>
       <w:proofErr w:type="spellStart"/>
+      <w:proofErr w:type="gramEnd"/>
       <w:r>
         <w:rPr>
           <w:rFonts w:ascii="Lucida Console" w:eastAsia="Lucida Console" w:hAnsi="Lucida Console" w:cs="Lucida Console"/>
@@ -4866,17 +5112,7 @@
           <w:sz w:val="20"/>
           <w:szCs w:val="20"/>
         </w:rPr>
-        <w:t xml:space="preserve">   </w:t>
-      </w:r>
-      <w:proofErr w:type="gramEnd"/>
-      <w:r>
-        <w:rPr>
-          <w:rFonts w:ascii="Lucida Console" w:eastAsia="Lucida Console" w:hAnsi="Lucida Console" w:cs="Lucida Console"/>
-          <w:color w:val="000000" w:themeColor="text1"/>
-          <w:sz w:val="20"/>
-          <w:szCs w:val="20"/>
-        </w:rPr>
-        <w:t xml:space="preserve">        </w:t>
+        <w:t xml:space="preserve">           </w:t>
       </w:r>
       <w:proofErr w:type="spellStart"/>
       <w:r>
@@ -5011,7 +5247,25 @@
           <w:sz w:val="22"/>
           <w:szCs w:val="22"/>
         </w:rPr>
-        <w:t xml:space="preserve"> refiere a ‘Urban </w:t>
+        <w:t xml:space="preserve"> refiere a ‘</w:t>
+      </w:r>
+      <w:proofErr w:type="spellStart"/>
+      <w:r>
+        <w:rPr>
+          <w:rFonts w:ascii="Calibri" w:eastAsia="Calibri" w:hAnsi="Calibri" w:cs="Calibri"/>
+          <w:sz w:val="22"/>
+          <w:szCs w:val="22"/>
+        </w:rPr>
+        <w:t>Urban</w:t>
+      </w:r>
+      <w:proofErr w:type="spellEnd"/>
+      <w:r>
+        <w:rPr>
+          <w:rFonts w:ascii="Calibri" w:eastAsia="Calibri" w:hAnsi="Calibri" w:cs="Calibri"/>
+          <w:sz w:val="22"/>
+          <w:szCs w:val="22"/>
+        </w:rPr>
+        <w:t xml:space="preserve"> </w:t>
       </w:r>
       <w:proofErr w:type="spellStart"/>
       <w:r>
@@ -5257,6 +5511,7 @@
       <w:r>
         <w:rPr>
           <w:noProof/>
+          <w:lang w:eastAsia="es-MX"/>
         </w:rPr>
         <w:drawing>
           <wp:anchor distT="0" distB="0" distL="114300" distR="114300" simplePos="0" relativeHeight="251658240" behindDoc="0" locked="0" layoutInCell="1" allowOverlap="1" wp14:anchorId="4F5DF3AB" wp14:editId="11D9FCD8">
@@ -5356,7 +5611,7 @@
           <w:szCs w:val="22"/>
         </w:rPr>
       </w:pPr>
-      <w:bookmarkStart w:id="8" w:name="_Toc223370982"/>
+      <w:bookmarkStart w:id="11" w:name="_Toc224999479"/>
       <w:r>
         <w:t xml:space="preserve">3.1.3 Corrección del </w:t>
       </w:r>
@@ -5368,7 +5623,7 @@
       <w:r>
         <w:t xml:space="preserve"> inicial</w:t>
       </w:r>
-      <w:bookmarkEnd w:id="8"/>
+      <w:bookmarkEnd w:id="11"/>
     </w:p>
     <w:p>
       <w:r>
@@ -5500,7 +5755,7 @@
       <w:pPr>
         <w:pStyle w:val="Ttulo3"/>
       </w:pPr>
-      <w:bookmarkStart w:id="9" w:name="_Toc223370983"/>
+      <w:bookmarkStart w:id="12" w:name="_Toc224999480"/>
       <w:r>
         <w:t xml:space="preserve">3.2 </w:t>
       </w:r>
@@ -5520,7 +5775,7 @@
       <w:r>
         <w:t xml:space="preserve"> inicial</w:t>
       </w:r>
-      <w:bookmarkEnd w:id="9"/>
+      <w:bookmarkEnd w:id="12"/>
     </w:p>
     <w:p>
       <w:r>
@@ -5730,7 +5985,6 @@
         <w:t xml:space="preserve"> &lt;- </w:t>
       </w:r>
       <w:proofErr w:type="spellStart"/>
-      <w:proofErr w:type="gramStart"/>
       <w:r>
         <w:rPr>
           <w:rFonts w:ascii="Lucida Console" w:eastAsia="Lucida Console" w:hAnsi="Lucida Console" w:cs="Lucida Console"/>
@@ -5751,7 +6005,6 @@
         <w:t>(</w:t>
       </w:r>
       <w:proofErr w:type="spellStart"/>
-      <w:proofErr w:type="gramEnd"/>
       <w:r>
         <w:rPr>
           <w:rFonts w:ascii="Lucida Console" w:eastAsia="Lucida Console" w:hAnsi="Lucida Console" w:cs="Lucida Console"/>
@@ -5796,6 +6049,7 @@
       <w:r>
         <w:rPr>
           <w:noProof/>
+          <w:lang w:eastAsia="es-MX"/>
         </w:rPr>
         <w:drawing>
           <wp:inline distT="0" distB="0" distL="0" distR="0" wp14:anchorId="30B50BE3" wp14:editId="5323C5CC">
@@ -5842,26 +6096,26 @@
     </w:p>
     <w:p>
       <w:r>
+        <w:t>Ahora, para acercarnos a nuestro objetivo de ‘</w:t>
+      </w:r>
+      <w:r>
+        <w:rPr>
+          <w:rFonts w:ascii="Aptos" w:eastAsia="Aptos" w:hAnsi="Aptos" w:cs="Aptos"/>
+        </w:rPr>
+        <w:t>Comparar estados altamente urbanos con alta criminalidad vs estados poco urbanos con baja criminalidad.’, vamos a hacer otra separación. Primero con los estados altamente urbanos y con alta criminalidad.</w:t>
+      </w:r>
+    </w:p>
+    <w:p>
+      <w:pPr>
+        <w:rPr>
+          <w:rFonts w:ascii="Aptos" w:eastAsia="Aptos" w:hAnsi="Aptos" w:cs="Aptos"/>
+        </w:rPr>
+      </w:pPr>
+      <w:r>
+        <w:rPr>
+          <w:rFonts w:ascii="Aptos" w:eastAsia="Aptos" w:hAnsi="Aptos" w:cs="Aptos"/>
+        </w:rPr>
         <w:lastRenderedPageBreak/>
-        <w:t>Ahora, para acercarnos a nuestro objetivo de ‘</w:t>
-      </w:r>
-      <w:r>
-        <w:rPr>
-          <w:rFonts w:ascii="Aptos" w:eastAsia="Aptos" w:hAnsi="Aptos" w:cs="Aptos"/>
-        </w:rPr>
-        <w:t>Comparar estados altamente urbanos con alta criminalidad vs estados poco urbanos con baja criminalidad.’, vamos a hacer otra separación. Primero con los estados altamente urbanos y con alta criminalidad.</w:t>
-      </w:r>
-    </w:p>
-    <w:p>
-      <w:pPr>
-        <w:rPr>
-          <w:rFonts w:ascii="Aptos" w:eastAsia="Aptos" w:hAnsi="Aptos" w:cs="Aptos"/>
-        </w:rPr>
-      </w:pPr>
-      <w:r>
-        <w:rPr>
-          <w:rFonts w:ascii="Aptos" w:eastAsia="Aptos" w:hAnsi="Aptos" w:cs="Aptos"/>
-        </w:rPr>
         <w:t xml:space="preserve">Pero para calificar nuevamente qué es </w:t>
       </w:r>
       <w:r>
@@ -5897,6 +6151,7 @@
       <w:r>
         <w:rPr>
           <w:noProof/>
+          <w:lang w:eastAsia="es-MX"/>
         </w:rPr>
         <w:drawing>
           <wp:inline distT="0" distB="0" distL="0" distR="0" wp14:anchorId="2150AD25" wp14:editId="4B01977B">
@@ -5939,6 +6194,7 @@
       <w:r>
         <w:rPr>
           <w:noProof/>
+          <w:lang w:eastAsia="es-MX"/>
         </w:rPr>
         <w:drawing>
           <wp:inline distT="0" distB="0" distL="0" distR="0" wp14:anchorId="0121BB23" wp14:editId="4110216D">
@@ -6036,21 +6292,14 @@
     </w:p>
     <w:p>
       <w:r>
-        <w:t xml:space="preserve">Y cualquier valor por encima </w:t>
-      </w:r>
-      <w:proofErr w:type="gramStart"/>
-      <w:r>
-        <w:t>de  esos</w:t>
-      </w:r>
-      <w:proofErr w:type="gramEnd"/>
-      <w:r>
-        <w:t xml:space="preserve"> en sus respectivas categorías lo vamos a considerar atípicamente ‘Alto’.</w:t>
+        <w:t>Y cualquier valor por encima de  esos en sus respectivas categorías lo vamos a considerar atípicamente ‘Alto’.</w:t>
       </w:r>
     </w:p>
     <w:p>
       <w:r>
         <w:rPr>
           <w:noProof/>
+          <w:lang w:eastAsia="es-MX"/>
         </w:rPr>
         <w:lastRenderedPageBreak/>
         <w:drawing>
@@ -6147,15 +6396,7 @@
     </w:p>
     <w:p>
       <w:r>
-        <w:t xml:space="preserve">Y cualquier valor por encima </w:t>
-      </w:r>
-      <w:proofErr w:type="gramStart"/>
-      <w:r>
-        <w:t>de  esos</w:t>
-      </w:r>
-      <w:proofErr w:type="gramEnd"/>
-      <w:r>
-        <w:t xml:space="preserve"> en sus respectivas categorías lo vamos a considerar atípicamente ‘Alto’.</w:t>
+        <w:t>Y cualquier valor por encima de  esos en sus respectivas categorías lo vamos a considerar atípicamente ‘Alto’.</w:t>
       </w:r>
     </w:p>
     <w:p>
@@ -6719,6 +6960,7 @@
       <w:r>
         <w:rPr>
           <w:noProof/>
+          <w:lang w:eastAsia="es-MX"/>
         </w:rPr>
         <w:drawing>
           <wp:anchor distT="0" distB="0" distL="114300" distR="114300" simplePos="0" relativeHeight="251661312" behindDoc="0" locked="0" layoutInCell="1" allowOverlap="1" wp14:anchorId="4A61C629" wp14:editId="28EAD81A">
@@ -6779,6 +7021,7 @@
       <w:r>
         <w:rPr>
           <w:noProof/>
+          <w:lang w:eastAsia="es-MX"/>
         </w:rPr>
         <w:drawing>
           <wp:anchor distT="0" distB="0" distL="114300" distR="114300" simplePos="0" relativeHeight="251662336" behindDoc="0" locked="0" layoutInCell="1" allowOverlap="1" wp14:anchorId="50581BFB" wp14:editId="2168FE66">
@@ -6945,6 +7188,7 @@
       <w:r>
         <w:rPr>
           <w:noProof/>
+          <w:lang w:eastAsia="es-MX"/>
         </w:rPr>
         <w:drawing>
           <wp:inline distT="0" distB="0" distL="0" distR="0" wp14:anchorId="4F09341D" wp14:editId="4CBE5197">
@@ -7082,15 +7326,7 @@
         <w:t>Sin embargo</w:t>
       </w:r>
       <w:r>
-        <w:t xml:space="preserve">, falla bastante en la </w:t>
-      </w:r>
-      <w:proofErr w:type="gramStart"/>
-      <w:r>
-        <w:t>tercer estadística</w:t>
-      </w:r>
-      <w:proofErr w:type="gramEnd"/>
-      <w:r>
-        <w:t xml:space="preserve"> con:</w:t>
+        <w:t>, falla bastante en la tercer estadística con:</w:t>
       </w:r>
       <w:r>
         <w:br/>
@@ -7155,7 +7391,7 @@
       <w:pPr>
         <w:pStyle w:val="Ttulo3"/>
       </w:pPr>
-      <w:bookmarkStart w:id="10" w:name="_Toc223370984"/>
+      <w:bookmarkStart w:id="13" w:name="_Toc224999481"/>
       <w:r>
         <w:t>3</w:t>
       </w:r>
@@ -7172,7 +7408,7 @@
       <w:r>
         <w:t>dataset</w:t>
       </w:r>
-      <w:bookmarkEnd w:id="10"/>
+      <w:bookmarkEnd w:id="13"/>
       <w:proofErr w:type="spellEnd"/>
     </w:p>
     <w:p>
@@ -7223,13 +7459,14 @@
       </w:r>
       <w:r>
         <w:br/>
+        <w:t xml:space="preserve">Por lo que vale la pena aceptar la interpretación de que esta estadística </w:t>
+      </w:r>
+      <w:r>
+        <w:t xml:space="preserve">de asesinatos </w:t>
       </w:r>
       <w:r>
         <w:lastRenderedPageBreak/>
-        <w:t xml:space="preserve">Por lo que vale la pena aceptar la interpretación de que esta estadística </w:t>
-      </w:r>
-      <w:r>
-        <w:t>de asesinatos en estados No-Urbanizados</w:t>
+        <w:t>en estados No-Urbanizados</w:t>
       </w:r>
       <w:r>
         <w:t xml:space="preserve"> está concentrada en casos específicos y no </w:t>
@@ -7302,8 +7539,8 @@
 </file>
 
 <file path=word/numbering.xml><?xml version="1.0" encoding="utf-8"?>
-<w:numbering xmlns:wpc="http://schemas.microsoft.com/office/word/2010/wordprocessingCanvas" xmlns:cx="http://schemas.microsoft.com/office/drawing/2014/chartex" xmlns:cx1="http://schemas.microsoft.com/office/drawing/2015/9/8/chartex" xmlns:cx2="http://schemas.microsoft.com/office/drawing/2015/10/21/chartex" xmlns:cx3="http://schemas.microsoft.com/office/drawing/2016/5/9/chartex" xmlns:cx4="http://schemas.microsoft.com/office/drawing/2016/5/10/chartex" xmlns:cx5="http://schemas.microsoft.com/office/drawing/2016/5/11/chartex" xmlns:cx6="http://schemas.microsoft.com/office/drawing/2016/5/12/chartex" xmlns:cx7="http://schemas.microsoft.com/office/drawing/2016/5/13/chartex" xmlns:cx8="http://schemas.microsoft.com/office/drawing/2016/5/14/chartex" xmlns:mc="http://schemas.openxmlformats.org/markup-compatibility/2006" xmlns:aink="http://schemas.microsoft.com/office/drawing/2016/ink" xmlns:am3d="http://schemas.microsoft.com/office/drawing/2017/model3d" xmlns:o="urn:schemas-microsoft-com:office:office" xmlns:oel="http://schemas.microsoft.com/office/2019/extlst" xmlns:r="http://schemas.openxmlformats.org/officeDocument/2006/relationships" xmlns:m="http://schemas.openxmlformats.org/officeDocument/2006/math" xmlns:v="urn:schemas-microsoft-com:vml" xmlns:wp14="http://schemas.microsoft.com/office/word/2010/wordprocessingDrawing" xmlns:wp="http://schemas.openxmlformats.org/drawingml/2006/wordprocessingDrawing" xmlns:w10="urn:schemas-microsoft-com:office:word" xmlns:w="http://schemas.openxmlformats.org/wordprocessingml/2006/main" xmlns:w14="http://schemas.microsoft.com/office/word/2010/wordml" xmlns:w15="http://schemas.microsoft.com/office/word/2012/wordml" xmlns:w16cex="http://schemas.microsoft.com/office/word/2018/wordml/cex" xmlns:w16cid="http://schemas.microsoft.com/office/word/2016/wordml/cid" xmlns:w16="http://schemas.microsoft.com/office/word/2018/wordml" xmlns:w16du="http://schemas.microsoft.com/office/word/2023/wordml/word16du" xmlns:w16sdtdh="http://schemas.microsoft.com/office/word/2020/wordml/sdtdatahash" xmlns:w16sdtfl="http://schemas.microsoft.com/office/word/2024/wordml/sdtformatlock" xmlns:w16se="http://schemas.microsoft.com/office/word/2015/wordml/symex" xmlns:wpg="http://schemas.microsoft.com/office/word/2010/wordprocessingGroup" xmlns:wpi="http://schemas.microsoft.com/office/word/2010/wordprocessingInk" xmlns:wne="http://schemas.microsoft.com/office/word/2006/wordml" xmlns:wps="http://schemas.microsoft.com/office/word/2010/wordprocessingShape" mc:Ignorable="w14 w15 w16se w16cid w16 w16cex w16sdtdh w16sdtfl w16du wp14">
-  <w:abstractNum w:abstractNumId="0" w15:restartNumberingAfterBreak="0">
+<w:numbering xmlns:wpc="http://schemas.microsoft.com/office/word/2010/wordprocessingCanvas" xmlns:mc="http://schemas.openxmlformats.org/markup-compatibility/2006" xmlns:o="urn:schemas-microsoft-com:office:office" xmlns:r="http://schemas.openxmlformats.org/officeDocument/2006/relationships" xmlns:m="http://schemas.openxmlformats.org/officeDocument/2006/math" xmlns:v="urn:schemas-microsoft-com:vml" xmlns:wp14="http://schemas.microsoft.com/office/word/2010/wordprocessingDrawing" xmlns:wp="http://schemas.openxmlformats.org/drawingml/2006/wordprocessingDrawing" xmlns:w10="urn:schemas-microsoft-com:office:word" xmlns:w="http://schemas.openxmlformats.org/wordprocessingml/2006/main" xmlns:w14="http://schemas.microsoft.com/office/word/2010/wordml" xmlns:w15="http://schemas.microsoft.com/office/word/2012/wordml" xmlns:wpg="http://schemas.microsoft.com/office/word/2010/wordprocessingGroup" xmlns:wpi="http://schemas.microsoft.com/office/word/2010/wordprocessingInk" xmlns:wne="http://schemas.microsoft.com/office/word/2006/wordml" xmlns:wps="http://schemas.microsoft.com/office/word/2010/wordprocessingShape" mc:Ignorable="w14 w15 wp14">
+  <w:abstractNum w:abstractNumId="0">
     <w:nsid w:val="0B1C32FC"/>
     <w:multiLevelType w:val="hybridMultilevel"/>
     <w:tmpl w:val="301639D8"/>
@@ -7416,7 +7653,7 @@
       </w:rPr>
     </w:lvl>
   </w:abstractNum>
-  <w:abstractNum w:abstractNumId="1" w15:restartNumberingAfterBreak="0">
+  <w:abstractNum w:abstractNumId="1">
     <w:nsid w:val="0FE02C2D"/>
     <w:multiLevelType w:val="hybridMultilevel"/>
     <w:tmpl w:val="50BCC15C"/>
@@ -7529,7 +7766,7 @@
       </w:rPr>
     </w:lvl>
   </w:abstractNum>
-  <w:abstractNum w:abstractNumId="2" w15:restartNumberingAfterBreak="0">
+  <w:abstractNum w:abstractNumId="2">
     <w:nsid w:val="11CE4B11"/>
     <w:multiLevelType w:val="hybridMultilevel"/>
     <w:tmpl w:val="2F505710"/>
@@ -7642,7 +7879,7 @@
       </w:rPr>
     </w:lvl>
   </w:abstractNum>
-  <w:abstractNum w:abstractNumId="3" w15:restartNumberingAfterBreak="0">
+  <w:abstractNum w:abstractNumId="3">
     <w:nsid w:val="1FCA494C"/>
     <w:multiLevelType w:val="hybridMultilevel"/>
     <w:tmpl w:val="01989052"/>
@@ -7755,7 +7992,7 @@
       </w:rPr>
     </w:lvl>
   </w:abstractNum>
-  <w:abstractNum w:abstractNumId="4" w15:restartNumberingAfterBreak="0">
+  <w:abstractNum w:abstractNumId="4">
     <w:nsid w:val="445D602E"/>
     <w:multiLevelType w:val="hybridMultilevel"/>
     <w:tmpl w:val="3B209608"/>
@@ -7868,7 +8105,7 @@
       </w:rPr>
     </w:lvl>
   </w:abstractNum>
-  <w:abstractNum w:abstractNumId="5" w15:restartNumberingAfterBreak="0">
+  <w:abstractNum w:abstractNumId="5">
     <w:nsid w:val="475D75FE"/>
     <w:multiLevelType w:val="hybridMultilevel"/>
     <w:tmpl w:val="A7DC2A88"/>
@@ -7981,7 +8218,7 @@
       </w:rPr>
     </w:lvl>
   </w:abstractNum>
-  <w:abstractNum w:abstractNumId="6" w15:restartNumberingAfterBreak="0">
+  <w:abstractNum w:abstractNumId="6">
     <w:nsid w:val="4DDB1CCD"/>
     <w:multiLevelType w:val="hybridMultilevel"/>
     <w:tmpl w:val="1F7C510C"/>
@@ -8094,7 +8331,7 @@
       </w:rPr>
     </w:lvl>
   </w:abstractNum>
-  <w:abstractNum w:abstractNumId="7" w15:restartNumberingAfterBreak="0">
+  <w:abstractNum w:abstractNumId="7">
     <w:nsid w:val="581C68C9"/>
     <w:multiLevelType w:val="hybridMultilevel"/>
     <w:tmpl w:val="59D0DB0A"/>
@@ -8207,7 +8444,7 @@
       </w:rPr>
     </w:lvl>
   </w:abstractNum>
-  <w:abstractNum w:abstractNumId="8" w15:restartNumberingAfterBreak="0">
+  <w:abstractNum w:abstractNumId="8">
     <w:nsid w:val="62657DE2"/>
     <w:multiLevelType w:val="hybridMultilevel"/>
     <w:tmpl w:val="49828C7C"/>
@@ -8320,7 +8557,7 @@
       </w:rPr>
     </w:lvl>
   </w:abstractNum>
-  <w:abstractNum w:abstractNumId="9" w15:restartNumberingAfterBreak="0">
+  <w:abstractNum w:abstractNumId="9">
     <w:nsid w:val="659E1CC5"/>
     <w:multiLevelType w:val="hybridMultilevel"/>
     <w:tmpl w:val="B02E8928"/>
@@ -8433,7 +8670,7 @@
       </w:rPr>
     </w:lvl>
   </w:abstractNum>
-  <w:abstractNum w:abstractNumId="10" w15:restartNumberingAfterBreak="0">
+  <w:abstractNum w:abstractNumId="10">
     <w:nsid w:val="6AA17384"/>
     <w:multiLevelType w:val="multilevel"/>
     <w:tmpl w:val="B9CC5E9E"/>
@@ -8582,7 +8819,7 @@
       </w:rPr>
     </w:lvl>
   </w:abstractNum>
-  <w:abstractNum w:abstractNumId="11" w15:restartNumberingAfterBreak="0">
+  <w:abstractNum w:abstractNumId="11">
     <w:nsid w:val="70F23B25"/>
     <w:multiLevelType w:val="hybridMultilevel"/>
     <w:tmpl w:val="7E00329E"/>
@@ -8695,7 +8932,7 @@
       </w:rPr>
     </w:lvl>
   </w:abstractNum>
-  <w:abstractNum w:abstractNumId="12" w15:restartNumberingAfterBreak="0">
+  <w:abstractNum w:abstractNumId="12">
     <w:nsid w:val="71005E1F"/>
     <w:multiLevelType w:val="hybridMultilevel"/>
     <w:tmpl w:val="2A80F456"/>
@@ -8783,7 +9020,7 @@
       </w:pPr>
     </w:lvl>
   </w:abstractNum>
-  <w:abstractNum w:abstractNumId="13" w15:restartNumberingAfterBreak="0">
+  <w:abstractNum w:abstractNumId="13">
     <w:nsid w:val="73CF2156"/>
     <w:multiLevelType w:val="hybridMultilevel"/>
     <w:tmpl w:val="55E6CB84"/>
@@ -8896,53 +9133,53 @@
       </w:rPr>
     </w:lvl>
   </w:abstractNum>
-  <w:num w:numId="1" w16cid:durableId="2091851873">
+  <w:num w:numId="1">
     <w:abstractNumId w:val="1"/>
   </w:num>
-  <w:num w:numId="2" w16cid:durableId="1067798024">
+  <w:num w:numId="2">
     <w:abstractNumId w:val="0"/>
   </w:num>
-  <w:num w:numId="3" w16cid:durableId="9646852">
+  <w:num w:numId="3">
     <w:abstractNumId w:val="3"/>
   </w:num>
-  <w:num w:numId="4" w16cid:durableId="1724787420">
+  <w:num w:numId="4">
     <w:abstractNumId w:val="13"/>
   </w:num>
-  <w:num w:numId="5" w16cid:durableId="961040457">
+  <w:num w:numId="5">
     <w:abstractNumId w:val="5"/>
   </w:num>
-  <w:num w:numId="6" w16cid:durableId="809057822">
+  <w:num w:numId="6">
     <w:abstractNumId w:val="6"/>
   </w:num>
-  <w:num w:numId="7" w16cid:durableId="954021543">
+  <w:num w:numId="7">
     <w:abstractNumId w:val="8"/>
   </w:num>
-  <w:num w:numId="8" w16cid:durableId="1162044590">
+  <w:num w:numId="8">
     <w:abstractNumId w:val="11"/>
   </w:num>
-  <w:num w:numId="9" w16cid:durableId="596836465">
+  <w:num w:numId="9">
     <w:abstractNumId w:val="10"/>
   </w:num>
-  <w:num w:numId="10" w16cid:durableId="1619751705">
+  <w:num w:numId="10">
     <w:abstractNumId w:val="4"/>
   </w:num>
-  <w:num w:numId="11" w16cid:durableId="306059462">
+  <w:num w:numId="11">
     <w:abstractNumId w:val="2"/>
   </w:num>
-  <w:num w:numId="12" w16cid:durableId="1086465018">
+  <w:num w:numId="12">
     <w:abstractNumId w:val="9"/>
   </w:num>
-  <w:num w:numId="13" w16cid:durableId="890774993">
+  <w:num w:numId="13">
     <w:abstractNumId w:val="12"/>
   </w:num>
-  <w:num w:numId="14" w16cid:durableId="1542402213">
+  <w:num w:numId="14">
     <w:abstractNumId w:val="7"/>
   </w:num>
 </w:numbering>
 </file>
 
 <file path=word/styles.xml><?xml version="1.0" encoding="utf-8"?>
-<w:styles xmlns:mc="http://schemas.openxmlformats.org/markup-compatibility/2006" xmlns:r="http://schemas.openxmlformats.org/officeDocument/2006/relationships" xmlns:w="http://schemas.openxmlformats.org/wordprocessingml/2006/main" xmlns:w14="http://schemas.microsoft.com/office/word/2010/wordml" xmlns:w15="http://schemas.microsoft.com/office/word/2012/wordml" xmlns:w16cex="http://schemas.microsoft.com/office/word/2018/wordml/cex" xmlns:w16cid="http://schemas.microsoft.com/office/word/2016/wordml/cid" xmlns:w16="http://schemas.microsoft.com/office/word/2018/wordml" xmlns:w16du="http://schemas.microsoft.com/office/word/2023/wordml/word16du" xmlns:w16sdtdh="http://schemas.microsoft.com/office/word/2020/wordml/sdtdatahash" xmlns:w16sdtfl="http://schemas.microsoft.com/office/word/2024/wordml/sdtformatlock" xmlns:w16se="http://schemas.microsoft.com/office/word/2015/wordml/symex" mc:Ignorable="w14 w15 w16se w16cid w16 w16cex w16sdtdh w16sdtfl w16du">
+<w:styles xmlns:mc="http://schemas.openxmlformats.org/markup-compatibility/2006" xmlns:r="http://schemas.openxmlformats.org/officeDocument/2006/relationships" xmlns:w="http://schemas.openxmlformats.org/wordprocessingml/2006/main" xmlns:w14="http://schemas.microsoft.com/office/word/2010/wordml" xmlns:w15="http://schemas.microsoft.com/office/word/2012/wordml" mc:Ignorable="w14 w15">
   <w:docDefaults>
     <w:rPrDefault>
       <w:rPr>
@@ -8960,7 +9197,7 @@
       </w:pPr>
     </w:pPrDefault>
   </w:docDefaults>
-  <w:latentStyles w:defLockedState="0" w:defUIPriority="99" w:defSemiHidden="0" w:defUnhideWhenUsed="0" w:defQFormat="0" w:count="376">
+  <w:latentStyles w:defLockedState="0" w:defUIPriority="99" w:defSemiHidden="0" w:defUnhideWhenUsed="0" w:defQFormat="0" w:count="371">
     <w:lsdException w:name="Normal" w:uiPriority="0" w:qFormat="1"/>
     <w:lsdException w:name="heading 1" w:uiPriority="9" w:qFormat="1"/>
     <w:lsdException w:name="heading 2" w:semiHidden="1" w:uiPriority="9" w:unhideWhenUsed="1" w:qFormat="1"/>
@@ -9332,11 +9569,6 @@
     <w:lsdException w:name="List Table 5 Dark Accent 6" w:uiPriority="50"/>
     <w:lsdException w:name="List Table 6 Colorful Accent 6" w:uiPriority="51"/>
     <w:lsdException w:name="List Table 7 Colorful Accent 6" w:uiPriority="52"/>
-    <w:lsdException w:name="Mention" w:semiHidden="1" w:unhideWhenUsed="1"/>
-    <w:lsdException w:name="Smart Hyperlink" w:semiHidden="1" w:unhideWhenUsed="1"/>
-    <w:lsdException w:name="Hashtag" w:semiHidden="1" w:unhideWhenUsed="1"/>
-    <w:lsdException w:name="Unresolved Mention" w:semiHidden="1" w:unhideWhenUsed="1"/>
-    <w:lsdException w:name="Smart Link" w:semiHidden="1" w:unhideWhenUsed="1"/>
   </w:latentStyles>
   <w:style w:type="paragraph" w:default="1" w:styleId="Normal">
     <w:name w:val="Normal"/>
@@ -9698,11 +9930,11 @@
       <w:lang w:val="es-MX"/>
     </w:rPr>
   </w:style>
-  <w:style w:type="paragraph" w:styleId="Ttulo">
+  <w:style w:type="paragraph" w:styleId="Puesto">
     <w:name w:val="Title"/>
     <w:basedOn w:val="Normal"/>
     <w:next w:val="Normal"/>
-    <w:link w:val="TtuloCar"/>
+    <w:link w:val="PuestoCar"/>
     <w:uiPriority w:val="10"/>
     <w:qFormat/>
     <w:rsid w:val="00ED56A2"/>
@@ -9718,10 +9950,10 @@
       <w:szCs w:val="56"/>
     </w:rPr>
   </w:style>
-  <w:style w:type="character" w:customStyle="1" w:styleId="TtuloCar">
-    <w:name w:val="Título Car"/>
+  <w:style w:type="character" w:customStyle="1" w:styleId="PuestoCar">
+    <w:name w:val="Puesto Car"/>
     <w:basedOn w:val="Fuentedeprrafopredeter"/>
-    <w:link w:val="Ttulo"/>
+    <w:link w:val="Puesto"/>
     <w:uiPriority w:val="10"/>
     <w:rsid w:val="00ED56A2"/>
     <w:rPr>
@@ -9886,6 +10118,7 @@
       <w:lang w:val="es-US" w:eastAsia="es-ES"/>
     </w:rPr>
     <w:tblPr>
+      <w:tblInd w:w="0" w:type="dxa"/>
       <w:tblBorders>
         <w:top w:val="single" w:sz="4" w:space="0" w:color="000000" w:themeColor="text1"/>
         <w:left w:val="single" w:sz="4" w:space="0" w:color="000000" w:themeColor="text1"/>
@@ -9894,6 +10127,12 @@
         <w:insideH w:val="single" w:sz="4" w:space="0" w:color="000000" w:themeColor="text1"/>
         <w:insideV w:val="single" w:sz="4" w:space="0" w:color="000000" w:themeColor="text1"/>
       </w:tblBorders>
+      <w:tblCellMar>
+        <w:top w:w="0" w:type="dxa"/>
+        <w:left w:w="108" w:type="dxa"/>
+        <w:bottom w:w="0" w:type="dxa"/>
+        <w:right w:w="108" w:type="dxa"/>
+      </w:tblCellMar>
     </w:tblPr>
   </w:style>
   <w:style w:type="paragraph" w:styleId="NormalWeb">
@@ -9907,7 +10146,7 @@
       <w:rFonts w:ascii="Times New Roman" w:hAnsi="Times New Roman" w:cs="Times New Roman"/>
     </w:rPr>
   </w:style>
-  <w:style w:type="paragraph" w:styleId="TtuloTDC">
+  <w:style w:type="paragraph" w:styleId="TtulodeTDC">
     <w:name w:val="TOC Heading"/>
     <w:basedOn w:val="Ttulo1"/>
     <w:next w:val="Normal"/>
@@ -10279,7 +10518,7 @@
 </file>
 
 <file path=customXml/itemProps1.xml><?xml version="1.0" encoding="utf-8"?>
-<ds:datastoreItem xmlns:ds="http://schemas.openxmlformats.org/officeDocument/2006/customXml" ds:itemID="{7A2A7403-C16F-4818-ABD4-3C31FC12CFDE}">
+<ds:datastoreItem xmlns:ds="http://schemas.openxmlformats.org/officeDocument/2006/customXml" ds:itemID="{CF502812-F4AD-4BEF-BB24-FACCCC02F41B}">
   <ds:schemaRefs>
     <ds:schemaRef ds:uri="http://schemas.openxmlformats.org/officeDocument/2006/bibliography"/>
   </ds:schemaRefs>

</xml_diff>

<commit_message>
Finalizados: Minería de datos
Entrega de las tareas de MC
</commit_message>
<xml_diff>
--- a/Minería de datos/Practica 1/Práctica 1.docx
+++ b/Minería de datos/Practica 1/Práctica 1.docx
@@ -985,7 +985,7 @@
           <w:r>
             <w:fldChar w:fldCharType="separate"/>
           </w:r>
-          <w:hyperlink w:anchor="_Toc225049440" w:history="1">
+          <w:hyperlink w:anchor="_Toc225078486" w:history="1">
             <w:r>
               <w:rPr>
                 <w:rStyle w:val="Hipervnculo"/>
@@ -1012,7 +1012,7 @@
                 <w:noProof/>
                 <w:webHidden/>
               </w:rPr>
-              <w:instrText xml:space="preserve"> PAGEREF _Toc225049440 \h </w:instrText>
+              <w:instrText xml:space="preserve"> PAGEREF _Toc225078486 \h </w:instrText>
             </w:r>
             <w:r>
               <w:rPr>
@@ -1055,7 +1055,7 @@
               <w:lang w:eastAsia="es-MX"/>
             </w:rPr>
           </w:pPr>
-          <w:hyperlink w:anchor="_Toc225049441" w:history="1">
+          <w:hyperlink w:anchor="_Toc225078487" w:history="1">
             <w:r>
               <w:rPr>
                 <w:rStyle w:val="Hipervnculo"/>
@@ -1082,7 +1082,7 @@
                 <w:noProof/>
                 <w:webHidden/>
               </w:rPr>
-              <w:instrText xml:space="preserve"> PAGEREF _Toc225049441 \h </w:instrText>
+              <w:instrText xml:space="preserve"> PAGEREF _Toc225078487 \h </w:instrText>
             </w:r>
             <w:r>
               <w:rPr>
@@ -1125,7 +1125,7 @@
               <w:lang w:eastAsia="es-MX"/>
             </w:rPr>
           </w:pPr>
-          <w:hyperlink w:anchor="_Toc225049442" w:history="1">
+          <w:hyperlink w:anchor="_Toc225078488" w:history="1">
             <w:r>
               <w:rPr>
                 <w:rStyle w:val="Hipervnculo"/>
@@ -1152,7 +1152,7 @@
                 <w:noProof/>
                 <w:webHidden/>
               </w:rPr>
-              <w:instrText xml:space="preserve"> PAGEREF _Toc225049442 \h </w:instrText>
+              <w:instrText xml:space="preserve"> PAGEREF _Toc225078488 \h </w:instrText>
             </w:r>
             <w:r>
               <w:rPr>
@@ -1195,7 +1195,7 @@
               <w:lang w:eastAsia="es-MX"/>
             </w:rPr>
           </w:pPr>
-          <w:hyperlink w:anchor="_Toc225049443" w:history="1">
+          <w:hyperlink w:anchor="_Toc225078489" w:history="1">
             <w:r>
               <w:rPr>
                 <w:rStyle w:val="Hipervnculo"/>
@@ -1222,7 +1222,7 @@
                 <w:noProof/>
                 <w:webHidden/>
               </w:rPr>
-              <w:instrText xml:space="preserve"> PAGEREF _Toc225049443 \h </w:instrText>
+              <w:instrText xml:space="preserve"> PAGEREF _Toc225078489 \h </w:instrText>
             </w:r>
             <w:r>
               <w:rPr>
@@ -1265,7 +1265,7 @@
               <w:lang w:eastAsia="es-MX"/>
             </w:rPr>
           </w:pPr>
-          <w:hyperlink w:anchor="_Toc225049444" w:history="1">
+          <w:hyperlink w:anchor="_Toc225078490" w:history="1">
             <w:r>
               <w:rPr>
                 <w:rStyle w:val="Hipervnculo"/>
@@ -1292,7 +1292,7 @@
                 <w:noProof/>
                 <w:webHidden/>
               </w:rPr>
-              <w:instrText xml:space="preserve"> PAGEREF _Toc225049444 \h </w:instrText>
+              <w:instrText xml:space="preserve"> PAGEREF _Toc225078490 \h </w:instrText>
             </w:r>
             <w:r>
               <w:rPr>
@@ -1335,7 +1335,7 @@
               <w:lang w:eastAsia="es-MX"/>
             </w:rPr>
           </w:pPr>
-          <w:hyperlink w:anchor="_Toc225049445" w:history="1">
+          <w:hyperlink w:anchor="_Toc225078491" w:history="1">
             <w:r>
               <w:rPr>
                 <w:rStyle w:val="Hipervnculo"/>
@@ -1362,7 +1362,7 @@
                 <w:noProof/>
                 <w:webHidden/>
               </w:rPr>
-              <w:instrText xml:space="preserve"> PAGEREF _Toc225049445 \h </w:instrText>
+              <w:instrText xml:space="preserve"> PAGEREF _Toc225078491 \h </w:instrText>
             </w:r>
             <w:r>
               <w:rPr>
@@ -1405,7 +1405,7 @@
               <w:lang w:eastAsia="es-MX"/>
             </w:rPr>
           </w:pPr>
-          <w:hyperlink w:anchor="_Toc225049446" w:history="1">
+          <w:hyperlink w:anchor="_Toc225078492" w:history="1">
             <w:r>
               <w:rPr>
                 <w:rStyle w:val="Hipervnculo"/>
@@ -1432,7 +1432,7 @@
                 <w:noProof/>
                 <w:webHidden/>
               </w:rPr>
-              <w:instrText xml:space="preserve"> PAGEREF _Toc225049446 \h </w:instrText>
+              <w:instrText xml:space="preserve"> PAGEREF _Toc225078492 \h </w:instrText>
             </w:r>
             <w:r>
               <w:rPr>
@@ -1475,7 +1475,7 @@
               <w:lang w:eastAsia="es-MX"/>
             </w:rPr>
           </w:pPr>
-          <w:hyperlink w:anchor="_Toc225049447" w:history="1">
+          <w:hyperlink w:anchor="_Toc225078493" w:history="1">
             <w:r>
               <w:rPr>
                 <w:rStyle w:val="Hipervnculo"/>
@@ -1502,7 +1502,7 @@
                 <w:noProof/>
                 <w:webHidden/>
               </w:rPr>
-              <w:instrText xml:space="preserve"> PAGEREF _Toc225049447 \h </w:instrText>
+              <w:instrText xml:space="preserve"> PAGEREF _Toc225078493 \h </w:instrText>
             </w:r>
             <w:r>
               <w:rPr>
@@ -1545,7 +1545,7 @@
               <w:lang w:eastAsia="es-MX"/>
             </w:rPr>
           </w:pPr>
-          <w:hyperlink w:anchor="_Toc225049448" w:history="1">
+          <w:hyperlink w:anchor="_Toc225078494" w:history="1">
             <w:r>
               <w:rPr>
                 <w:rStyle w:val="Hipervnculo"/>
@@ -1572,7 +1572,7 @@
                 <w:noProof/>
                 <w:webHidden/>
               </w:rPr>
-              <w:instrText xml:space="preserve"> PAGEREF _Toc225049448 \h </w:instrText>
+              <w:instrText xml:space="preserve"> PAGEREF _Toc225078494 \h </w:instrText>
             </w:r>
             <w:r>
               <w:rPr>
@@ -1615,7 +1615,7 @@
               <w:lang w:eastAsia="es-MX"/>
             </w:rPr>
           </w:pPr>
-          <w:hyperlink w:anchor="_Toc225049449" w:history="1">
+          <w:hyperlink w:anchor="_Toc225078495" w:history="1">
             <w:r>
               <w:rPr>
                 <w:rStyle w:val="Hipervnculo"/>
@@ -1642,7 +1642,7 @@
                 <w:noProof/>
                 <w:webHidden/>
               </w:rPr>
-              <w:instrText xml:space="preserve"> PAGEREF _Toc225049449 \h </w:instrText>
+              <w:instrText xml:space="preserve"> PAGEREF _Toc225078495 \h </w:instrText>
             </w:r>
             <w:r>
               <w:rPr>
@@ -1685,7 +1685,7 @@
               <w:lang w:eastAsia="es-MX"/>
             </w:rPr>
           </w:pPr>
-          <w:hyperlink w:anchor="_Toc225049450" w:history="1">
+          <w:hyperlink w:anchor="_Toc225078496" w:history="1">
             <w:r>
               <w:rPr>
                 <w:rStyle w:val="Hipervnculo"/>
@@ -1712,7 +1712,7 @@
                 <w:noProof/>
                 <w:webHidden/>
               </w:rPr>
-              <w:instrText xml:space="preserve"> PAGEREF _Toc225049450 \h </w:instrText>
+              <w:instrText xml:space="preserve"> PAGEREF _Toc225078496 \h </w:instrText>
             </w:r>
             <w:r>
               <w:rPr>
@@ -1755,7 +1755,7 @@
               <w:lang w:eastAsia="es-MX"/>
             </w:rPr>
           </w:pPr>
-          <w:hyperlink w:anchor="_Toc225049451" w:history="1">
+          <w:hyperlink w:anchor="_Toc225078497" w:history="1">
             <w:r>
               <w:rPr>
                 <w:rStyle w:val="Hipervnculo"/>
@@ -1782,7 +1782,7 @@
                 <w:noProof/>
                 <w:webHidden/>
               </w:rPr>
-              <w:instrText xml:space="preserve"> PAGEREF _Toc225049451 \h </w:instrText>
+              <w:instrText xml:space="preserve"> PAGEREF _Toc225078497 \h </w:instrText>
             </w:r>
             <w:r>
               <w:rPr>
@@ -1825,7 +1825,7 @@
               <w:lang w:eastAsia="es-MX"/>
             </w:rPr>
           </w:pPr>
-          <w:hyperlink w:anchor="_Toc225049452" w:history="1">
+          <w:hyperlink w:anchor="_Toc225078498" w:history="1">
             <w:r>
               <w:rPr>
                 <w:rStyle w:val="Hipervnculo"/>
@@ -1852,7 +1852,7 @@
                 <w:noProof/>
                 <w:webHidden/>
               </w:rPr>
-              <w:instrText xml:space="preserve"> PAGEREF _Toc225049452 \h </w:instrText>
+              <w:instrText xml:space="preserve"> PAGEREF _Toc225078498 \h </w:instrText>
             </w:r>
             <w:r>
               <w:rPr>
@@ -1895,7 +1895,7 @@
               <w:lang w:eastAsia="es-MX"/>
             </w:rPr>
           </w:pPr>
-          <w:hyperlink w:anchor="_Toc225049453" w:history="1">
+          <w:hyperlink w:anchor="_Toc225078499" w:history="1">
             <w:r>
               <w:rPr>
                 <w:rStyle w:val="Hipervnculo"/>
@@ -1922,7 +1922,7 @@
                 <w:noProof/>
                 <w:webHidden/>
               </w:rPr>
-              <w:instrText xml:space="preserve"> PAGEREF _Toc225049453 \h </w:instrText>
+              <w:instrText xml:space="preserve"> PAGEREF _Toc225078499 \h </w:instrText>
             </w:r>
             <w:r>
               <w:rPr>
@@ -1965,7 +1965,7 @@
               <w:lang w:eastAsia="es-MX"/>
             </w:rPr>
           </w:pPr>
-          <w:hyperlink w:anchor="_Toc225049454" w:history="1">
+          <w:hyperlink w:anchor="_Toc225078500" w:history="1">
             <w:r>
               <w:rPr>
                 <w:rStyle w:val="Hipervnculo"/>
@@ -1992,7 +1992,7 @@
                 <w:noProof/>
                 <w:webHidden/>
               </w:rPr>
-              <w:instrText xml:space="preserve"> PAGEREF _Toc225049454 \h </w:instrText>
+              <w:instrText xml:space="preserve"> PAGEREF _Toc225078500 \h </w:instrText>
             </w:r>
             <w:r>
               <w:rPr>
@@ -2035,7 +2035,7 @@
               <w:lang w:eastAsia="es-MX"/>
             </w:rPr>
           </w:pPr>
-          <w:hyperlink w:anchor="_Toc225049455" w:history="1">
+          <w:hyperlink w:anchor="_Toc225078501" w:history="1">
             <w:r>
               <w:rPr>
                 <w:rStyle w:val="Hipervnculo"/>
@@ -2062,7 +2062,7 @@
                 <w:noProof/>
                 <w:webHidden/>
               </w:rPr>
-              <w:instrText xml:space="preserve"> PAGEREF _Toc225049455 \h </w:instrText>
+              <w:instrText xml:space="preserve"> PAGEREF _Toc225078501 \h </w:instrText>
             </w:r>
             <w:r>
               <w:rPr>
@@ -2105,7 +2105,7 @@
               <w:lang w:eastAsia="es-MX"/>
             </w:rPr>
           </w:pPr>
-          <w:hyperlink w:anchor="_Toc225049456" w:history="1">
+          <w:hyperlink w:anchor="_Toc225078502" w:history="1">
             <w:r>
               <w:rPr>
                 <w:rStyle w:val="Hipervnculo"/>
@@ -2132,7 +2132,7 @@
                 <w:noProof/>
                 <w:webHidden/>
               </w:rPr>
-              <w:instrText xml:space="preserve"> PAGEREF _Toc225049456 \h </w:instrText>
+              <w:instrText xml:space="preserve"> PAGEREF _Toc225078502 \h </w:instrText>
             </w:r>
             <w:r>
               <w:rPr>
@@ -2175,7 +2175,7 @@
               <w:lang w:eastAsia="es-MX"/>
             </w:rPr>
           </w:pPr>
-          <w:hyperlink w:anchor="_Toc225049457" w:history="1">
+          <w:hyperlink w:anchor="_Toc225078503" w:history="1">
             <w:r>
               <w:rPr>
                 <w:rStyle w:val="Hipervnculo"/>
@@ -2202,7 +2202,7 @@
                 <w:noProof/>
                 <w:webHidden/>
               </w:rPr>
-              <w:instrText xml:space="preserve"> PAGEREF _Toc225049457 \h </w:instrText>
+              <w:instrText xml:space="preserve"> PAGEREF _Toc225078503 \h </w:instrText>
             </w:r>
             <w:r>
               <w:rPr>
@@ -2245,7 +2245,7 @@
               <w:lang w:eastAsia="es-MX"/>
             </w:rPr>
           </w:pPr>
-          <w:hyperlink w:anchor="_Toc225049458" w:history="1">
+          <w:hyperlink w:anchor="_Toc225078504" w:history="1">
             <w:r>
               <w:rPr>
                 <w:rStyle w:val="Hipervnculo"/>
@@ -2272,7 +2272,7 @@
                 <w:noProof/>
                 <w:webHidden/>
               </w:rPr>
-              <w:instrText xml:space="preserve"> PAGEREF _Toc225049458 \h </w:instrText>
+              <w:instrText xml:space="preserve"> PAGEREF _Toc225078504 \h </w:instrText>
             </w:r>
             <w:r>
               <w:rPr>
@@ -2315,7 +2315,7 @@
               <w:lang w:eastAsia="es-MX"/>
             </w:rPr>
           </w:pPr>
-          <w:hyperlink w:anchor="_Toc225049459" w:history="1">
+          <w:hyperlink w:anchor="_Toc225078505" w:history="1">
             <w:r>
               <w:rPr>
                 <w:rStyle w:val="Hipervnculo"/>
@@ -2342,7 +2342,7 @@
                 <w:noProof/>
                 <w:webHidden/>
               </w:rPr>
-              <w:instrText xml:space="preserve"> PAGEREF _Toc225049459 \h </w:instrText>
+              <w:instrText xml:space="preserve"> PAGEREF _Toc225078505 \h </w:instrText>
             </w:r>
             <w:r>
               <w:rPr>
@@ -2385,7 +2385,7 @@
               <w:lang w:eastAsia="es-MX"/>
             </w:rPr>
           </w:pPr>
-          <w:hyperlink w:anchor="_Toc225049460" w:history="1">
+          <w:hyperlink w:anchor="_Toc225078506" w:history="1">
             <w:r>
               <w:rPr>
                 <w:rStyle w:val="Hipervnculo"/>
@@ -2412,7 +2412,7 @@
                 <w:noProof/>
                 <w:webHidden/>
               </w:rPr>
-              <w:instrText xml:space="preserve"> PAGEREF _Toc225049460 \h </w:instrText>
+              <w:instrText xml:space="preserve"> PAGEREF _Toc225078506 \h </w:instrText>
             </w:r>
             <w:r>
               <w:rPr>
@@ -2455,13 +2455,27 @@
               <w:lang w:eastAsia="es-MX"/>
             </w:rPr>
           </w:pPr>
-          <w:hyperlink w:anchor="_Toc225049461" w:history="1">
+          <w:hyperlink w:anchor="_Toc225078507" w:history="1">
             <w:r>
               <w:rPr>
                 <w:rStyle w:val="Hipervnculo"/>
                 <w:noProof/>
               </w:rPr>
-              <w:t>Conclusión del análisis de resultados (Actividad 3)</w:t>
+              <w:t>Conclusión del a</w:t>
+            </w:r>
+            <w:r>
+              <w:rPr>
+                <w:rStyle w:val="Hipervnculo"/>
+                <w:noProof/>
+              </w:rPr>
+              <w:t>n</w:t>
+            </w:r>
+            <w:r>
+              <w:rPr>
+                <w:rStyle w:val="Hipervnculo"/>
+                <w:noProof/>
+              </w:rPr>
+              <w:t>álisis de resultados (Actividad 3)</w:t>
             </w:r>
             <w:r>
               <w:rPr>
@@ -2482,7 +2496,7 @@
                 <w:noProof/>
                 <w:webHidden/>
               </w:rPr>
-              <w:instrText xml:space="preserve"> PAGEREF _Toc225049461 \h </w:instrText>
+              <w:instrText xml:space="preserve"> PAGEREF _Toc225078507 \h </w:instrText>
             </w:r>
             <w:r>
               <w:rPr>
@@ -2525,7 +2539,7 @@
               <w:lang w:eastAsia="es-MX"/>
             </w:rPr>
           </w:pPr>
-          <w:hyperlink w:anchor="_Toc225049462" w:history="1">
+          <w:hyperlink w:anchor="_Toc225078508" w:history="1">
             <w:r>
               <w:rPr>
                 <w:rStyle w:val="Hipervnculo"/>
@@ -2552,7 +2566,7 @@
                 <w:noProof/>
                 <w:webHidden/>
               </w:rPr>
-              <w:instrText xml:space="preserve"> PAGEREF _Toc225049462 \h </w:instrText>
+              <w:instrText xml:space="preserve"> PAGEREF _Toc225078508 \h </w:instrText>
             </w:r>
             <w:r>
               <w:rPr>
@@ -2595,7 +2609,7 @@
               <w:lang w:eastAsia="es-MX"/>
             </w:rPr>
           </w:pPr>
-          <w:hyperlink w:anchor="_Toc225049463" w:history="1">
+          <w:hyperlink w:anchor="_Toc225078509" w:history="1">
             <w:r>
               <w:rPr>
                 <w:rStyle w:val="Hipervnculo"/>
@@ -2622,7 +2636,7 @@
                 <w:noProof/>
                 <w:webHidden/>
               </w:rPr>
-              <w:instrText xml:space="preserve"> PAGEREF _Toc225049463 \h </w:instrText>
+              <w:instrText xml:space="preserve"> PAGEREF _Toc225078509 \h </w:instrText>
             </w:r>
             <w:r>
               <w:rPr>
@@ -2668,7 +2682,7 @@
       <w:pPr>
         <w:pStyle w:val="Ttulo1"/>
       </w:pPr>
-      <w:bookmarkStart w:id="0" w:name="_Toc225049440"/>
+      <w:bookmarkStart w:id="0" w:name="_Toc225078486"/>
       <w:r>
         <w:lastRenderedPageBreak/>
         <w:t>O</w:t>
@@ -2687,7 +2701,7 @@
       <w:pPr>
         <w:pStyle w:val="Ttulo1"/>
       </w:pPr>
-      <w:bookmarkStart w:id="1" w:name="_Toc225049441"/>
+      <w:bookmarkStart w:id="1" w:name="_Toc225078487"/>
       <w:r>
         <w:t>Marco teórico</w:t>
       </w:r>
@@ -2697,7 +2711,7 @@
       <w:pPr>
         <w:pStyle w:val="Ttulo2"/>
       </w:pPr>
-      <w:bookmarkStart w:id="2" w:name="_Toc225049442"/>
+      <w:bookmarkStart w:id="2" w:name="_Toc225078488"/>
       <w:r>
         <w:t>Tratamiento de datos</w:t>
       </w:r>
@@ -2742,7 +2756,7 @@
       <w:r>
         <w:t xml:space="preserve"> </w:t>
       </w:r>
-      <w:bookmarkStart w:id="3" w:name="_Toc225049443"/>
+      <w:bookmarkStart w:id="3" w:name="_Toc225078489"/>
       <w:r>
         <w:t>Eliminación de instancias repetidas</w:t>
       </w:r>
@@ -2830,7 +2844,7 @@
       <w:pPr>
         <w:pStyle w:val="Ttulo2"/>
       </w:pPr>
-      <w:bookmarkStart w:id="4" w:name="_Toc225049444"/>
+      <w:bookmarkStart w:id="4" w:name="_Toc225078490"/>
       <w:r>
         <w:t>Eliminación de instancias incompletas</w:t>
       </w:r>
@@ -2931,7 +2945,7 @@
       <w:pPr>
         <w:pStyle w:val="Ttulo2"/>
       </w:pPr>
-      <w:bookmarkStart w:id="5" w:name="_Toc225049445"/>
+      <w:bookmarkStart w:id="5" w:name="_Toc225078491"/>
       <w:r>
         <w:t>Eliminación de datos correlacionados entre sí</w:t>
       </w:r>
@@ -3046,7 +3060,7 @@
       <w:r>
         <w:t xml:space="preserve"> </w:t>
       </w:r>
-      <w:bookmarkStart w:id="6" w:name="_Toc225049446"/>
+      <w:bookmarkStart w:id="6" w:name="_Toc225078492"/>
       <w:r>
         <w:t>Proyección de datos incompletos</w:t>
       </w:r>
@@ -3080,7 +3094,7 @@
       <w:r>
         <w:t xml:space="preserve"> </w:t>
       </w:r>
-      <w:bookmarkStart w:id="7" w:name="_Toc225049447"/>
+      <w:bookmarkStart w:id="7" w:name="_Toc225078493"/>
       <w:r>
         <w:t>Escalado de datos</w:t>
       </w:r>
@@ -3112,7 +3126,7 @@
       <w:r>
         <w:t xml:space="preserve"> </w:t>
       </w:r>
-      <w:bookmarkStart w:id="8" w:name="_Toc225049448"/>
+      <w:bookmarkStart w:id="8" w:name="_Toc225078494"/>
       <w:r>
         <w:t>Escalado con Estadístico Z (Estandarización)</w:t>
       </w:r>
@@ -3224,7 +3238,7 @@
       <w:r>
         <w:t xml:space="preserve"> </w:t>
       </w:r>
-      <w:bookmarkStart w:id="9" w:name="_Toc225049449"/>
+      <w:bookmarkStart w:id="9" w:name="_Toc225078495"/>
       <w:r>
         <w:t>Escalado con Línea Recta (Normalización Min-Max)</w:t>
       </w:r>
@@ -3260,7 +3274,7 @@
       <w:pPr>
         <w:pStyle w:val="Ttulo2"/>
       </w:pPr>
-      <w:bookmarkStart w:id="10" w:name="_Toc225049450"/>
+      <w:bookmarkStart w:id="10" w:name="_Toc225078496"/>
       <w:r>
         <w:lastRenderedPageBreak/>
         <w:t>Paquetes de R utilizados</w:t>
@@ -3359,7 +3373,7 @@
       <w:pPr>
         <w:pStyle w:val="Ttulo1"/>
       </w:pPr>
-      <w:bookmarkStart w:id="11" w:name="_Toc225049451"/>
+      <w:bookmarkStart w:id="11" w:name="_Toc225078497"/>
       <w:r>
         <w:t>Desarrollo</w:t>
       </w:r>
@@ -3369,7 +3383,7 @@
       <w:pPr>
         <w:pStyle w:val="Ttulo2"/>
       </w:pPr>
-      <w:bookmarkStart w:id="12" w:name="_Toc225049452"/>
+      <w:bookmarkStart w:id="12" w:name="_Toc225078498"/>
       <w:r>
         <w:t>Actividad 1: Indicadores del World Bank Open Data</w:t>
       </w:r>
@@ -3623,7 +3637,7 @@
       <w:pPr>
         <w:pStyle w:val="Ttulo2"/>
       </w:pPr>
-      <w:bookmarkStart w:id="13" w:name="_Toc225049453"/>
+      <w:bookmarkStart w:id="13" w:name="_Toc225078499"/>
       <w:r>
         <w:t xml:space="preserve">Actividad 2: </w:t>
       </w:r>
@@ -4121,7 +4135,7 @@
       <w:pPr>
         <w:pStyle w:val="Ttulo2"/>
       </w:pPr>
-      <w:bookmarkStart w:id="14" w:name="_Toc225049454"/>
+      <w:bookmarkStart w:id="14" w:name="_Toc225078500"/>
       <w:r>
         <w:t>Actividad 3: Análisis de Criminalidad y Urbanización en Estados Unidos (</w:t>
       </w:r>
@@ -4430,7 +4444,7 @@
       <w:pPr>
         <w:pStyle w:val="Ttulo1"/>
       </w:pPr>
-      <w:bookmarkStart w:id="15" w:name="_Toc225049455"/>
+      <w:bookmarkStart w:id="15" w:name="_Toc225078501"/>
       <w:r>
         <w:t>Cálculos y resultados</w:t>
       </w:r>
@@ -4440,7 +4454,7 @@
       <w:pPr>
         <w:pStyle w:val="Ttulo2"/>
       </w:pPr>
-      <w:bookmarkStart w:id="16" w:name="_Toc225049456"/>
+      <w:bookmarkStart w:id="16" w:name="_Toc225078502"/>
       <w:r>
         <w:t>Actividad 1: Indicadores del World Bank Open Data</w:t>
       </w:r>
@@ -5575,7 +5589,7 @@
       <w:pPr>
         <w:pStyle w:val="Ttulo3"/>
       </w:pPr>
-      <w:bookmarkStart w:id="17" w:name="_Toc225049457"/>
+      <w:bookmarkStart w:id="17" w:name="_Toc225078503"/>
       <w:r>
         <w:t>Conclusión del análisis (Actividad 1)</w:t>
       </w:r>
@@ -5810,7 +5824,7 @@
       <w:pPr>
         <w:pStyle w:val="Ttulo2"/>
       </w:pPr>
-      <w:bookmarkStart w:id="18" w:name="_Toc225049458"/>
+      <w:bookmarkStart w:id="18" w:name="_Toc225078504"/>
       <w:r>
         <w:t xml:space="preserve">Actividad 2: </w:t>
       </w:r>
@@ -8772,7 +8786,7 @@
       <w:pPr>
         <w:pStyle w:val="Ttulo3"/>
       </w:pPr>
-      <w:bookmarkStart w:id="19" w:name="_Toc225049459"/>
+      <w:bookmarkStart w:id="19" w:name="_Toc225078505"/>
       <w:r>
         <w:t>Conclusión del análisis (Actividad 2)</w:t>
       </w:r>
@@ -8880,7 +8894,7 @@
       <w:pPr>
         <w:pStyle w:val="Ttulo2"/>
       </w:pPr>
-      <w:bookmarkStart w:id="20" w:name="_Toc225049460"/>
+      <w:bookmarkStart w:id="20" w:name="_Toc225078506"/>
       <w:r>
         <w:t>Actividad 3: Análisis de Criminalidad y Urbanización en Estados Unidos (</w:t>
       </w:r>
@@ -11190,9 +11204,12 @@
       <w:pPr>
         <w:pStyle w:val="Ttulo3"/>
       </w:pPr>
-      <w:bookmarkStart w:id="21" w:name="_Toc225049461"/>
-      <w:r>
-        <w:t>Conclusión de</w:t>
+      <w:bookmarkStart w:id="21" w:name="_Toc225078507"/>
+      <w:r>
+        <w:t>Síntesis</w:t>
+      </w:r>
+      <w:r>
+        <w:t xml:space="preserve"> de</w:t>
       </w:r>
       <w:r>
         <w:t xml:space="preserve">l análisis de resultados (Actividad </w:t>
@@ -11316,7 +11333,7 @@
       <w:pPr>
         <w:pStyle w:val="Ttulo1"/>
       </w:pPr>
-      <w:bookmarkStart w:id="22" w:name="_Toc225049462"/>
+      <w:bookmarkStart w:id="22" w:name="_Toc225078508"/>
       <w:r>
         <w:t>Conclusión de la práctica</w:t>
       </w:r>
@@ -11379,7 +11396,7 @@
       <w:pPr>
         <w:pStyle w:val="Ttulo1"/>
       </w:pPr>
-      <w:bookmarkStart w:id="23" w:name="_Toc225049463"/>
+      <w:bookmarkStart w:id="23" w:name="_Toc225078509"/>
       <w:r>
         <w:t>Referencias</w:t>
       </w:r>

</xml_diff>